<commit_message>
Update validation documents and script
</commit_message>
<xml_diff>
--- a/NCA_Assistant_User_Manual_v1.3.docx
+++ b/NCA_Assistant_User_Manual_v1.3.docx
@@ -104,7 +104,6 @@
     </w:p>
     <w:p>
       <w:pPr>
-        <w:spacing w:after="0"/>
         <w:jc w:val="center"/>
       </w:pPr>
       <w:r>
@@ -707,7 +706,6 @@
         <w:alias w:val="Table of Contents"/>
         <w:id w:val="-1533791606"/>
       </w:sdtPr>
-      <w:sdtEndPr/>
       <w:sdtContent>
         <w:p>
           <w:pPr>
@@ -721,7 +719,11 @@
           </w:pPr>
           <w:r>
             <w:fldChar w:fldCharType="begin"/>
+          </w:r>
+          <w:r>
             <w:instrText>TOC \h \o "1-3"</w:instrText>
+          </w:r>
+          <w:r>
             <w:fldChar w:fldCharType="separate"/>
           </w:r>
           <w:hyperlink w:anchor="_Toc226195249" w:history="1">
@@ -737,10 +739,40 @@
                 <w:noProof/>
               </w:rPr>
               <w:tab/>
+            </w:r>
+            <w:r>
+              <w:rPr>
+                <w:noProof/>
+              </w:rPr>
               <w:fldChar w:fldCharType="begin"/>
+            </w:r>
+            <w:r>
+              <w:rPr>
+                <w:noProof/>
+              </w:rPr>
               <w:instrText xml:space="preserve"> PAGEREF _Toc226195249 \h </w:instrText>
+            </w:r>
+            <w:r>
+              <w:rPr>
+                <w:noProof/>
+              </w:rPr>
+            </w:r>
+            <w:r>
+              <w:rPr>
+                <w:noProof/>
+              </w:rPr>
               <w:fldChar w:fldCharType="separate"/>
+            </w:r>
+            <w:r>
+              <w:rPr>
+                <w:noProof/>
+              </w:rPr>
               <w:t>2</w:t>
+            </w:r>
+            <w:r>
+              <w:rPr>
+                <w:noProof/>
+              </w:rPr>
               <w:fldChar w:fldCharType="end"/>
             </w:r>
           </w:hyperlink>
@@ -768,10 +800,40 @@
                 <w:noProof/>
               </w:rPr>
               <w:tab/>
+            </w:r>
+            <w:r>
+              <w:rPr>
+                <w:noProof/>
+              </w:rPr>
               <w:fldChar w:fldCharType="begin"/>
+            </w:r>
+            <w:r>
+              <w:rPr>
+                <w:noProof/>
+              </w:rPr>
               <w:instrText xml:space="preserve"> PAGEREF _Toc226195250 \h </w:instrText>
+            </w:r>
+            <w:r>
+              <w:rPr>
+                <w:noProof/>
+              </w:rPr>
+            </w:r>
+            <w:r>
+              <w:rPr>
+                <w:noProof/>
+              </w:rPr>
               <w:fldChar w:fldCharType="separate"/>
+            </w:r>
+            <w:r>
+              <w:rPr>
+                <w:noProof/>
+              </w:rPr>
               <w:t>3</w:t>
+            </w:r>
+            <w:r>
+              <w:rPr>
+                <w:noProof/>
+              </w:rPr>
               <w:fldChar w:fldCharType="end"/>
             </w:r>
           </w:hyperlink>
@@ -799,10 +861,40 @@
                 <w:noProof/>
               </w:rPr>
               <w:tab/>
+            </w:r>
+            <w:r>
+              <w:rPr>
+                <w:noProof/>
+              </w:rPr>
               <w:fldChar w:fldCharType="begin"/>
+            </w:r>
+            <w:r>
+              <w:rPr>
+                <w:noProof/>
+              </w:rPr>
               <w:instrText xml:space="preserve"> PAGEREF _Toc226195251 \h </w:instrText>
+            </w:r>
+            <w:r>
+              <w:rPr>
+                <w:noProof/>
+              </w:rPr>
+            </w:r>
+            <w:r>
+              <w:rPr>
+                <w:noProof/>
+              </w:rPr>
               <w:fldChar w:fldCharType="separate"/>
+            </w:r>
+            <w:r>
+              <w:rPr>
+                <w:noProof/>
+              </w:rPr>
               <w:t>5</w:t>
+            </w:r>
+            <w:r>
+              <w:rPr>
+                <w:noProof/>
+              </w:rPr>
               <w:fldChar w:fldCharType="end"/>
             </w:r>
           </w:hyperlink>
@@ -830,10 +922,40 @@
                 <w:noProof/>
               </w:rPr>
               <w:tab/>
+            </w:r>
+            <w:r>
+              <w:rPr>
+                <w:noProof/>
+              </w:rPr>
               <w:fldChar w:fldCharType="begin"/>
+            </w:r>
+            <w:r>
+              <w:rPr>
+                <w:noProof/>
+              </w:rPr>
               <w:instrText xml:space="preserve"> PAGEREF _Toc226195252 \h </w:instrText>
+            </w:r>
+            <w:r>
+              <w:rPr>
+                <w:noProof/>
+              </w:rPr>
+            </w:r>
+            <w:r>
+              <w:rPr>
+                <w:noProof/>
+              </w:rPr>
               <w:fldChar w:fldCharType="separate"/>
+            </w:r>
+            <w:r>
+              <w:rPr>
+                <w:noProof/>
+              </w:rPr>
               <w:t>6</w:t>
+            </w:r>
+            <w:r>
+              <w:rPr>
+                <w:noProof/>
+              </w:rPr>
               <w:fldChar w:fldCharType="end"/>
             </w:r>
           </w:hyperlink>
@@ -861,10 +983,40 @@
                 <w:noProof/>
               </w:rPr>
               <w:tab/>
+            </w:r>
+            <w:r>
+              <w:rPr>
+                <w:noProof/>
+              </w:rPr>
               <w:fldChar w:fldCharType="begin"/>
+            </w:r>
+            <w:r>
+              <w:rPr>
+                <w:noProof/>
+              </w:rPr>
               <w:instrText xml:space="preserve"> PAGEREF _Toc226195253 \h </w:instrText>
+            </w:r>
+            <w:r>
+              <w:rPr>
+                <w:noProof/>
+              </w:rPr>
+            </w:r>
+            <w:r>
+              <w:rPr>
+                <w:noProof/>
+              </w:rPr>
               <w:fldChar w:fldCharType="separate"/>
+            </w:r>
+            <w:r>
+              <w:rPr>
+                <w:noProof/>
+              </w:rPr>
               <w:t>6</w:t>
+            </w:r>
+            <w:r>
+              <w:rPr>
+                <w:noProof/>
+              </w:rPr>
               <w:fldChar w:fldCharType="end"/>
             </w:r>
           </w:hyperlink>
@@ -892,10 +1044,40 @@
                 <w:noProof/>
               </w:rPr>
               <w:tab/>
+            </w:r>
+            <w:r>
+              <w:rPr>
+                <w:noProof/>
+              </w:rPr>
               <w:fldChar w:fldCharType="begin"/>
+            </w:r>
+            <w:r>
+              <w:rPr>
+                <w:noProof/>
+              </w:rPr>
               <w:instrText xml:space="preserve"> PAGEREF _Toc226195254 \h </w:instrText>
+            </w:r>
+            <w:r>
+              <w:rPr>
+                <w:noProof/>
+              </w:rPr>
+            </w:r>
+            <w:r>
+              <w:rPr>
+                <w:noProof/>
+              </w:rPr>
               <w:fldChar w:fldCharType="separate"/>
+            </w:r>
+            <w:r>
+              <w:rPr>
+                <w:noProof/>
+              </w:rPr>
               <w:t>6</w:t>
+            </w:r>
+            <w:r>
+              <w:rPr>
+                <w:noProof/>
+              </w:rPr>
               <w:fldChar w:fldCharType="end"/>
             </w:r>
           </w:hyperlink>
@@ -923,10 +1105,40 @@
                 <w:noProof/>
               </w:rPr>
               <w:tab/>
+            </w:r>
+            <w:r>
+              <w:rPr>
+                <w:noProof/>
+              </w:rPr>
               <w:fldChar w:fldCharType="begin"/>
+            </w:r>
+            <w:r>
+              <w:rPr>
+                <w:noProof/>
+              </w:rPr>
               <w:instrText xml:space="preserve"> PAGEREF _Toc226195255 \h </w:instrText>
+            </w:r>
+            <w:r>
+              <w:rPr>
+                <w:noProof/>
+              </w:rPr>
+            </w:r>
+            <w:r>
+              <w:rPr>
+                <w:noProof/>
+              </w:rPr>
               <w:fldChar w:fldCharType="separate"/>
+            </w:r>
+            <w:r>
+              <w:rPr>
+                <w:noProof/>
+              </w:rPr>
               <w:t>6</w:t>
+            </w:r>
+            <w:r>
+              <w:rPr>
+                <w:noProof/>
+              </w:rPr>
               <w:fldChar w:fldCharType="end"/>
             </w:r>
           </w:hyperlink>
@@ -954,10 +1166,40 @@
                 <w:noProof/>
               </w:rPr>
               <w:tab/>
+            </w:r>
+            <w:r>
+              <w:rPr>
+                <w:noProof/>
+              </w:rPr>
               <w:fldChar w:fldCharType="begin"/>
+            </w:r>
+            <w:r>
+              <w:rPr>
+                <w:noProof/>
+              </w:rPr>
               <w:instrText xml:space="preserve"> PAGEREF _Toc226195256 \h </w:instrText>
+            </w:r>
+            <w:r>
+              <w:rPr>
+                <w:noProof/>
+              </w:rPr>
+            </w:r>
+            <w:r>
+              <w:rPr>
+                <w:noProof/>
+              </w:rPr>
               <w:fldChar w:fldCharType="separate"/>
+            </w:r>
+            <w:r>
+              <w:rPr>
+                <w:noProof/>
+              </w:rPr>
               <w:t>6</w:t>
+            </w:r>
+            <w:r>
+              <w:rPr>
+                <w:noProof/>
+              </w:rPr>
               <w:fldChar w:fldCharType="end"/>
             </w:r>
           </w:hyperlink>
@@ -985,10 +1227,40 @@
                 <w:noProof/>
               </w:rPr>
               <w:tab/>
+            </w:r>
+            <w:r>
+              <w:rPr>
+                <w:noProof/>
+              </w:rPr>
               <w:fldChar w:fldCharType="begin"/>
+            </w:r>
+            <w:r>
+              <w:rPr>
+                <w:noProof/>
+              </w:rPr>
               <w:instrText xml:space="preserve"> PAGEREF _Toc226195257 \h </w:instrText>
+            </w:r>
+            <w:r>
+              <w:rPr>
+                <w:noProof/>
+              </w:rPr>
+            </w:r>
+            <w:r>
+              <w:rPr>
+                <w:noProof/>
+              </w:rPr>
               <w:fldChar w:fldCharType="separate"/>
+            </w:r>
+            <w:r>
+              <w:rPr>
+                <w:noProof/>
+              </w:rPr>
               <w:t>6</w:t>
+            </w:r>
+            <w:r>
+              <w:rPr>
+                <w:noProof/>
+              </w:rPr>
               <w:fldChar w:fldCharType="end"/>
             </w:r>
           </w:hyperlink>
@@ -1016,10 +1288,40 @@
                 <w:noProof/>
               </w:rPr>
               <w:tab/>
+            </w:r>
+            <w:r>
+              <w:rPr>
+                <w:noProof/>
+              </w:rPr>
               <w:fldChar w:fldCharType="begin"/>
+            </w:r>
+            <w:r>
+              <w:rPr>
+                <w:noProof/>
+              </w:rPr>
               <w:instrText xml:space="preserve"> PAGEREF _Toc226195258 \h </w:instrText>
+            </w:r>
+            <w:r>
+              <w:rPr>
+                <w:noProof/>
+              </w:rPr>
+            </w:r>
+            <w:r>
+              <w:rPr>
+                <w:noProof/>
+              </w:rPr>
               <w:fldChar w:fldCharType="separate"/>
+            </w:r>
+            <w:r>
+              <w:rPr>
+                <w:noProof/>
+              </w:rPr>
               <w:t>8</w:t>
+            </w:r>
+            <w:r>
+              <w:rPr>
+                <w:noProof/>
+              </w:rPr>
               <w:fldChar w:fldCharType="end"/>
             </w:r>
           </w:hyperlink>
@@ -1047,10 +1349,40 @@
                 <w:noProof/>
               </w:rPr>
               <w:tab/>
+            </w:r>
+            <w:r>
+              <w:rPr>
+                <w:noProof/>
+              </w:rPr>
               <w:fldChar w:fldCharType="begin"/>
+            </w:r>
+            <w:r>
+              <w:rPr>
+                <w:noProof/>
+              </w:rPr>
               <w:instrText xml:space="preserve"> PAGEREF _Toc226195259 \h </w:instrText>
+            </w:r>
+            <w:r>
+              <w:rPr>
+                <w:noProof/>
+              </w:rPr>
+            </w:r>
+            <w:r>
+              <w:rPr>
+                <w:noProof/>
+              </w:rPr>
               <w:fldChar w:fldCharType="separate"/>
+            </w:r>
+            <w:r>
+              <w:rPr>
+                <w:noProof/>
+              </w:rPr>
               <w:t>8</w:t>
+            </w:r>
+            <w:r>
+              <w:rPr>
+                <w:noProof/>
+              </w:rPr>
               <w:fldChar w:fldCharType="end"/>
             </w:r>
           </w:hyperlink>
@@ -1078,10 +1410,40 @@
                 <w:noProof/>
               </w:rPr>
               <w:tab/>
+            </w:r>
+            <w:r>
+              <w:rPr>
+                <w:noProof/>
+              </w:rPr>
               <w:fldChar w:fldCharType="begin"/>
+            </w:r>
+            <w:r>
+              <w:rPr>
+                <w:noProof/>
+              </w:rPr>
               <w:instrText xml:space="preserve"> PAGEREF _Toc226195260 \h </w:instrText>
+            </w:r>
+            <w:r>
+              <w:rPr>
+                <w:noProof/>
+              </w:rPr>
+            </w:r>
+            <w:r>
+              <w:rPr>
+                <w:noProof/>
+              </w:rPr>
               <w:fldChar w:fldCharType="separate"/>
+            </w:r>
+            <w:r>
+              <w:rPr>
+                <w:noProof/>
+              </w:rPr>
               <w:t>8</w:t>
+            </w:r>
+            <w:r>
+              <w:rPr>
+                <w:noProof/>
+              </w:rPr>
               <w:fldChar w:fldCharType="end"/>
             </w:r>
           </w:hyperlink>
@@ -1109,10 +1471,40 @@
                 <w:noProof/>
               </w:rPr>
               <w:tab/>
+            </w:r>
+            <w:r>
+              <w:rPr>
+                <w:noProof/>
+              </w:rPr>
               <w:fldChar w:fldCharType="begin"/>
+            </w:r>
+            <w:r>
+              <w:rPr>
+                <w:noProof/>
+              </w:rPr>
               <w:instrText xml:space="preserve"> PAGEREF _Toc226195261 \h </w:instrText>
+            </w:r>
+            <w:r>
+              <w:rPr>
+                <w:noProof/>
+              </w:rPr>
+            </w:r>
+            <w:r>
+              <w:rPr>
+                <w:noProof/>
+              </w:rPr>
               <w:fldChar w:fldCharType="separate"/>
+            </w:r>
+            <w:r>
+              <w:rPr>
+                <w:noProof/>
+              </w:rPr>
               <w:t>8</w:t>
+            </w:r>
+            <w:r>
+              <w:rPr>
+                <w:noProof/>
+              </w:rPr>
               <w:fldChar w:fldCharType="end"/>
             </w:r>
           </w:hyperlink>
@@ -1140,10 +1532,40 @@
                 <w:noProof/>
               </w:rPr>
               <w:tab/>
+            </w:r>
+            <w:r>
+              <w:rPr>
+                <w:noProof/>
+              </w:rPr>
               <w:fldChar w:fldCharType="begin"/>
+            </w:r>
+            <w:r>
+              <w:rPr>
+                <w:noProof/>
+              </w:rPr>
               <w:instrText xml:space="preserve"> PAGEREF _Toc226195262 \h </w:instrText>
+            </w:r>
+            <w:r>
+              <w:rPr>
+                <w:noProof/>
+              </w:rPr>
+            </w:r>
+            <w:r>
+              <w:rPr>
+                <w:noProof/>
+              </w:rPr>
               <w:fldChar w:fldCharType="separate"/>
+            </w:r>
+            <w:r>
+              <w:rPr>
+                <w:noProof/>
+              </w:rPr>
               <w:t>8</w:t>
+            </w:r>
+            <w:r>
+              <w:rPr>
+                <w:noProof/>
+              </w:rPr>
               <w:fldChar w:fldCharType="end"/>
             </w:r>
           </w:hyperlink>
@@ -1171,10 +1593,40 @@
                 <w:noProof/>
               </w:rPr>
               <w:tab/>
+            </w:r>
+            <w:r>
+              <w:rPr>
+                <w:noProof/>
+              </w:rPr>
               <w:fldChar w:fldCharType="begin"/>
+            </w:r>
+            <w:r>
+              <w:rPr>
+                <w:noProof/>
+              </w:rPr>
               <w:instrText xml:space="preserve"> PAGEREF _Toc226195263 \h </w:instrText>
+            </w:r>
+            <w:r>
+              <w:rPr>
+                <w:noProof/>
+              </w:rPr>
+            </w:r>
+            <w:r>
+              <w:rPr>
+                <w:noProof/>
+              </w:rPr>
               <w:fldChar w:fldCharType="separate"/>
+            </w:r>
+            <w:r>
+              <w:rPr>
+                <w:noProof/>
+              </w:rPr>
               <w:t>8</w:t>
+            </w:r>
+            <w:r>
+              <w:rPr>
+                <w:noProof/>
+              </w:rPr>
               <w:fldChar w:fldCharType="end"/>
             </w:r>
           </w:hyperlink>
@@ -1202,10 +1654,40 @@
                 <w:noProof/>
               </w:rPr>
               <w:tab/>
+            </w:r>
+            <w:r>
+              <w:rPr>
+                <w:noProof/>
+              </w:rPr>
               <w:fldChar w:fldCharType="begin"/>
+            </w:r>
+            <w:r>
+              <w:rPr>
+                <w:noProof/>
+              </w:rPr>
               <w:instrText xml:space="preserve"> PAGEREF _Toc226195264 \h </w:instrText>
+            </w:r>
+            <w:r>
+              <w:rPr>
+                <w:noProof/>
+              </w:rPr>
+            </w:r>
+            <w:r>
+              <w:rPr>
+                <w:noProof/>
+              </w:rPr>
               <w:fldChar w:fldCharType="separate"/>
+            </w:r>
+            <w:r>
+              <w:rPr>
+                <w:noProof/>
+              </w:rPr>
               <w:t>9</w:t>
+            </w:r>
+            <w:r>
+              <w:rPr>
+                <w:noProof/>
+              </w:rPr>
               <w:fldChar w:fldCharType="end"/>
             </w:r>
           </w:hyperlink>
@@ -1233,10 +1715,40 @@
                 <w:noProof/>
               </w:rPr>
               <w:tab/>
+            </w:r>
+            <w:r>
+              <w:rPr>
+                <w:noProof/>
+              </w:rPr>
               <w:fldChar w:fldCharType="begin"/>
+            </w:r>
+            <w:r>
+              <w:rPr>
+                <w:noProof/>
+              </w:rPr>
               <w:instrText xml:space="preserve"> PAGEREF _Toc226195265 \h </w:instrText>
+            </w:r>
+            <w:r>
+              <w:rPr>
+                <w:noProof/>
+              </w:rPr>
+            </w:r>
+            <w:r>
+              <w:rPr>
+                <w:noProof/>
+              </w:rPr>
               <w:fldChar w:fldCharType="separate"/>
+            </w:r>
+            <w:r>
+              <w:rPr>
+                <w:noProof/>
+              </w:rPr>
               <w:t>9</w:t>
+            </w:r>
+            <w:r>
+              <w:rPr>
+                <w:noProof/>
+              </w:rPr>
               <w:fldChar w:fldCharType="end"/>
             </w:r>
           </w:hyperlink>
@@ -1264,10 +1776,40 @@
                 <w:noProof/>
               </w:rPr>
               <w:tab/>
+            </w:r>
+            <w:r>
+              <w:rPr>
+                <w:noProof/>
+              </w:rPr>
               <w:fldChar w:fldCharType="begin"/>
+            </w:r>
+            <w:r>
+              <w:rPr>
+                <w:noProof/>
+              </w:rPr>
               <w:instrText xml:space="preserve"> PAGEREF _Toc226195266 \h </w:instrText>
+            </w:r>
+            <w:r>
+              <w:rPr>
+                <w:noProof/>
+              </w:rPr>
+            </w:r>
+            <w:r>
+              <w:rPr>
+                <w:noProof/>
+              </w:rPr>
               <w:fldChar w:fldCharType="separate"/>
+            </w:r>
+            <w:r>
+              <w:rPr>
+                <w:noProof/>
+              </w:rPr>
               <w:t>9</w:t>
+            </w:r>
+            <w:r>
+              <w:rPr>
+                <w:noProof/>
+              </w:rPr>
               <w:fldChar w:fldCharType="end"/>
             </w:r>
           </w:hyperlink>
@@ -1295,10 +1837,40 @@
                 <w:noProof/>
               </w:rPr>
               <w:tab/>
+            </w:r>
+            <w:r>
+              <w:rPr>
+                <w:noProof/>
+              </w:rPr>
               <w:fldChar w:fldCharType="begin"/>
+            </w:r>
+            <w:r>
+              <w:rPr>
+                <w:noProof/>
+              </w:rPr>
               <w:instrText xml:space="preserve"> PAGEREF _Toc226195267 \h </w:instrText>
+            </w:r>
+            <w:r>
+              <w:rPr>
+                <w:noProof/>
+              </w:rPr>
+            </w:r>
+            <w:r>
+              <w:rPr>
+                <w:noProof/>
+              </w:rPr>
               <w:fldChar w:fldCharType="separate"/>
+            </w:r>
+            <w:r>
+              <w:rPr>
+                <w:noProof/>
+              </w:rPr>
               <w:t>9</w:t>
+            </w:r>
+            <w:r>
+              <w:rPr>
+                <w:noProof/>
+              </w:rPr>
               <w:fldChar w:fldCharType="end"/>
             </w:r>
           </w:hyperlink>
@@ -1326,10 +1898,40 @@
                 <w:noProof/>
               </w:rPr>
               <w:tab/>
+            </w:r>
+            <w:r>
+              <w:rPr>
+                <w:noProof/>
+              </w:rPr>
               <w:fldChar w:fldCharType="begin"/>
+            </w:r>
+            <w:r>
+              <w:rPr>
+                <w:noProof/>
+              </w:rPr>
               <w:instrText xml:space="preserve"> PAGEREF _Toc226195268 \h </w:instrText>
+            </w:r>
+            <w:r>
+              <w:rPr>
+                <w:noProof/>
+              </w:rPr>
+            </w:r>
+            <w:r>
+              <w:rPr>
+                <w:noProof/>
+              </w:rPr>
               <w:fldChar w:fldCharType="separate"/>
+            </w:r>
+            <w:r>
+              <w:rPr>
+                <w:noProof/>
+              </w:rPr>
               <w:t>9</w:t>
+            </w:r>
+            <w:r>
+              <w:rPr>
+                <w:noProof/>
+              </w:rPr>
               <w:fldChar w:fldCharType="end"/>
             </w:r>
           </w:hyperlink>
@@ -1357,10 +1959,40 @@
                 <w:noProof/>
               </w:rPr>
               <w:tab/>
+            </w:r>
+            <w:r>
+              <w:rPr>
+                <w:noProof/>
+              </w:rPr>
               <w:fldChar w:fldCharType="begin"/>
+            </w:r>
+            <w:r>
+              <w:rPr>
+                <w:noProof/>
+              </w:rPr>
               <w:instrText xml:space="preserve"> PAGEREF _Toc226195269 \h </w:instrText>
+            </w:r>
+            <w:r>
+              <w:rPr>
+                <w:noProof/>
+              </w:rPr>
+            </w:r>
+            <w:r>
+              <w:rPr>
+                <w:noProof/>
+              </w:rPr>
               <w:fldChar w:fldCharType="separate"/>
+            </w:r>
+            <w:r>
+              <w:rPr>
+                <w:noProof/>
+              </w:rPr>
               <w:t>9</w:t>
+            </w:r>
+            <w:r>
+              <w:rPr>
+                <w:noProof/>
+              </w:rPr>
               <w:fldChar w:fldCharType="end"/>
             </w:r>
           </w:hyperlink>
@@ -1388,10 +2020,40 @@
                 <w:noProof/>
               </w:rPr>
               <w:tab/>
+            </w:r>
+            <w:r>
+              <w:rPr>
+                <w:noProof/>
+              </w:rPr>
               <w:fldChar w:fldCharType="begin"/>
+            </w:r>
+            <w:r>
+              <w:rPr>
+                <w:noProof/>
+              </w:rPr>
               <w:instrText xml:space="preserve"> PAGEREF _Toc226195270 \h </w:instrText>
+            </w:r>
+            <w:r>
+              <w:rPr>
+                <w:noProof/>
+              </w:rPr>
+            </w:r>
+            <w:r>
+              <w:rPr>
+                <w:noProof/>
+              </w:rPr>
               <w:fldChar w:fldCharType="separate"/>
+            </w:r>
+            <w:r>
+              <w:rPr>
+                <w:noProof/>
+              </w:rPr>
               <w:t>10</w:t>
+            </w:r>
+            <w:r>
+              <w:rPr>
+                <w:noProof/>
+              </w:rPr>
               <w:fldChar w:fldCharType="end"/>
             </w:r>
           </w:hyperlink>
@@ -1419,10 +2081,40 @@
                 <w:noProof/>
               </w:rPr>
               <w:tab/>
+            </w:r>
+            <w:r>
+              <w:rPr>
+                <w:noProof/>
+              </w:rPr>
               <w:fldChar w:fldCharType="begin"/>
+            </w:r>
+            <w:r>
+              <w:rPr>
+                <w:noProof/>
+              </w:rPr>
               <w:instrText xml:space="preserve"> PAGEREF _Toc226195271 \h </w:instrText>
+            </w:r>
+            <w:r>
+              <w:rPr>
+                <w:noProof/>
+              </w:rPr>
+            </w:r>
+            <w:r>
+              <w:rPr>
+                <w:noProof/>
+              </w:rPr>
               <w:fldChar w:fldCharType="separate"/>
+            </w:r>
+            <w:r>
+              <w:rPr>
+                <w:noProof/>
+              </w:rPr>
               <w:t>11</w:t>
+            </w:r>
+            <w:r>
+              <w:rPr>
+                <w:noProof/>
+              </w:rPr>
               <w:fldChar w:fldCharType="end"/>
             </w:r>
           </w:hyperlink>
@@ -1450,10 +2142,40 @@
                 <w:noProof/>
               </w:rPr>
               <w:tab/>
+            </w:r>
+            <w:r>
+              <w:rPr>
+                <w:noProof/>
+              </w:rPr>
               <w:fldChar w:fldCharType="begin"/>
+            </w:r>
+            <w:r>
+              <w:rPr>
+                <w:noProof/>
+              </w:rPr>
               <w:instrText xml:space="preserve"> PAGEREF _Toc226195272 \h </w:instrText>
+            </w:r>
+            <w:r>
+              <w:rPr>
+                <w:noProof/>
+              </w:rPr>
+            </w:r>
+            <w:r>
+              <w:rPr>
+                <w:noProof/>
+              </w:rPr>
               <w:fldChar w:fldCharType="separate"/>
+            </w:r>
+            <w:r>
+              <w:rPr>
+                <w:noProof/>
+              </w:rPr>
               <w:t>11</w:t>
+            </w:r>
+            <w:r>
+              <w:rPr>
+                <w:noProof/>
+              </w:rPr>
               <w:fldChar w:fldCharType="end"/>
             </w:r>
           </w:hyperlink>
@@ -1481,10 +2203,40 @@
                 <w:noProof/>
               </w:rPr>
               <w:tab/>
+            </w:r>
+            <w:r>
+              <w:rPr>
+                <w:noProof/>
+              </w:rPr>
               <w:fldChar w:fldCharType="begin"/>
+            </w:r>
+            <w:r>
+              <w:rPr>
+                <w:noProof/>
+              </w:rPr>
               <w:instrText xml:space="preserve"> PAGEREF _Toc226195273 \h </w:instrText>
+            </w:r>
+            <w:r>
+              <w:rPr>
+                <w:noProof/>
+              </w:rPr>
+            </w:r>
+            <w:r>
+              <w:rPr>
+                <w:noProof/>
+              </w:rPr>
               <w:fldChar w:fldCharType="separate"/>
+            </w:r>
+            <w:r>
+              <w:rPr>
+                <w:noProof/>
+              </w:rPr>
               <w:t>11</w:t>
+            </w:r>
+            <w:r>
+              <w:rPr>
+                <w:noProof/>
+              </w:rPr>
               <w:fldChar w:fldCharType="end"/>
             </w:r>
           </w:hyperlink>
@@ -1512,10 +2264,40 @@
                 <w:noProof/>
               </w:rPr>
               <w:tab/>
+            </w:r>
+            <w:r>
+              <w:rPr>
+                <w:noProof/>
+              </w:rPr>
               <w:fldChar w:fldCharType="begin"/>
+            </w:r>
+            <w:r>
+              <w:rPr>
+                <w:noProof/>
+              </w:rPr>
               <w:instrText xml:space="preserve"> PAGEREF _Toc226195274 \h </w:instrText>
+            </w:r>
+            <w:r>
+              <w:rPr>
+                <w:noProof/>
+              </w:rPr>
+            </w:r>
+            <w:r>
+              <w:rPr>
+                <w:noProof/>
+              </w:rPr>
               <w:fldChar w:fldCharType="separate"/>
+            </w:r>
+            <w:r>
+              <w:rPr>
+                <w:noProof/>
+              </w:rPr>
               <w:t>11</w:t>
+            </w:r>
+            <w:r>
+              <w:rPr>
+                <w:noProof/>
+              </w:rPr>
               <w:fldChar w:fldCharType="end"/>
             </w:r>
           </w:hyperlink>
@@ -1543,10 +2325,40 @@
                 <w:noProof/>
               </w:rPr>
               <w:tab/>
+            </w:r>
+            <w:r>
+              <w:rPr>
+                <w:noProof/>
+              </w:rPr>
               <w:fldChar w:fldCharType="begin"/>
+            </w:r>
+            <w:r>
+              <w:rPr>
+                <w:noProof/>
+              </w:rPr>
               <w:instrText xml:space="preserve"> PAGEREF _Toc226195290 \h </w:instrText>
+            </w:r>
+            <w:r>
+              <w:rPr>
+                <w:noProof/>
+              </w:rPr>
+            </w:r>
+            <w:r>
+              <w:rPr>
+                <w:noProof/>
+              </w:rPr>
               <w:fldChar w:fldCharType="separate"/>
+            </w:r>
+            <w:r>
+              <w:rPr>
+                <w:noProof/>
+              </w:rPr>
               <w:t>11</w:t>
+            </w:r>
+            <w:r>
+              <w:rPr>
+                <w:noProof/>
+              </w:rPr>
               <w:fldChar w:fldCharType="end"/>
             </w:r>
           </w:hyperlink>
@@ -1574,10 +2386,40 @@
                 <w:noProof/>
               </w:rPr>
               <w:tab/>
+            </w:r>
+            <w:r>
+              <w:rPr>
+                <w:noProof/>
+              </w:rPr>
               <w:fldChar w:fldCharType="begin"/>
+            </w:r>
+            <w:r>
+              <w:rPr>
+                <w:noProof/>
+              </w:rPr>
               <w:instrText xml:space="preserve"> PAGEREF _Toc226195291 \h </w:instrText>
+            </w:r>
+            <w:r>
+              <w:rPr>
+                <w:noProof/>
+              </w:rPr>
+            </w:r>
+            <w:r>
+              <w:rPr>
+                <w:noProof/>
+              </w:rPr>
               <w:fldChar w:fldCharType="separate"/>
+            </w:r>
+            <w:r>
+              <w:rPr>
+                <w:noProof/>
+              </w:rPr>
               <w:t>11</w:t>
+            </w:r>
+            <w:r>
+              <w:rPr>
+                <w:noProof/>
+              </w:rPr>
               <w:fldChar w:fldCharType="end"/>
             </w:r>
           </w:hyperlink>
@@ -1605,10 +2447,40 @@
                 <w:noProof/>
               </w:rPr>
               <w:tab/>
+            </w:r>
+            <w:r>
+              <w:rPr>
+                <w:noProof/>
+              </w:rPr>
               <w:fldChar w:fldCharType="begin"/>
+            </w:r>
+            <w:r>
+              <w:rPr>
+                <w:noProof/>
+              </w:rPr>
               <w:instrText xml:space="preserve"> PAGEREF _Toc226195276 \h </w:instrText>
+            </w:r>
+            <w:r>
+              <w:rPr>
+                <w:noProof/>
+              </w:rPr>
+            </w:r>
+            <w:r>
+              <w:rPr>
+                <w:noProof/>
+              </w:rPr>
               <w:fldChar w:fldCharType="separate"/>
+            </w:r>
+            <w:r>
+              <w:rPr>
+                <w:noProof/>
+              </w:rPr>
               <w:t>11</w:t>
+            </w:r>
+            <w:r>
+              <w:rPr>
+                <w:noProof/>
+              </w:rPr>
               <w:fldChar w:fldCharType="end"/>
             </w:r>
           </w:hyperlink>
@@ -1636,10 +2508,40 @@
                 <w:noProof/>
               </w:rPr>
               <w:tab/>
+            </w:r>
+            <w:r>
+              <w:rPr>
+                <w:noProof/>
+              </w:rPr>
               <w:fldChar w:fldCharType="begin"/>
+            </w:r>
+            <w:r>
+              <w:rPr>
+                <w:noProof/>
+              </w:rPr>
               <w:instrText xml:space="preserve"> PAGEREF _Toc226195277 \h </w:instrText>
+            </w:r>
+            <w:r>
+              <w:rPr>
+                <w:noProof/>
+              </w:rPr>
+            </w:r>
+            <w:r>
+              <w:rPr>
+                <w:noProof/>
+              </w:rPr>
               <w:fldChar w:fldCharType="separate"/>
+            </w:r>
+            <w:r>
+              <w:rPr>
+                <w:noProof/>
+              </w:rPr>
               <w:t>11</w:t>
+            </w:r>
+            <w:r>
+              <w:rPr>
+                <w:noProof/>
+              </w:rPr>
               <w:fldChar w:fldCharType="end"/>
             </w:r>
           </w:hyperlink>
@@ -1667,10 +2569,40 @@
                 <w:noProof/>
               </w:rPr>
               <w:tab/>
+            </w:r>
+            <w:r>
+              <w:rPr>
+                <w:noProof/>
+              </w:rPr>
               <w:fldChar w:fldCharType="begin"/>
+            </w:r>
+            <w:r>
+              <w:rPr>
+                <w:noProof/>
+              </w:rPr>
               <w:instrText xml:space="preserve"> PAGEREF _Toc226195278 \h </w:instrText>
+            </w:r>
+            <w:r>
+              <w:rPr>
+                <w:noProof/>
+              </w:rPr>
+            </w:r>
+            <w:r>
+              <w:rPr>
+                <w:noProof/>
+              </w:rPr>
               <w:fldChar w:fldCharType="separate"/>
+            </w:r>
+            <w:r>
+              <w:rPr>
+                <w:noProof/>
+              </w:rPr>
               <w:t>11</w:t>
+            </w:r>
+            <w:r>
+              <w:rPr>
+                <w:noProof/>
+              </w:rPr>
               <w:fldChar w:fldCharType="end"/>
             </w:r>
           </w:hyperlink>
@@ -1698,10 +2630,40 @@
                 <w:noProof/>
               </w:rPr>
               <w:tab/>
+            </w:r>
+            <w:r>
+              <w:rPr>
+                <w:noProof/>
+              </w:rPr>
               <w:fldChar w:fldCharType="begin"/>
+            </w:r>
+            <w:r>
+              <w:rPr>
+                <w:noProof/>
+              </w:rPr>
               <w:instrText xml:space="preserve"> PAGEREF _Toc226195279 \h </w:instrText>
+            </w:r>
+            <w:r>
+              <w:rPr>
+                <w:noProof/>
+              </w:rPr>
+            </w:r>
+            <w:r>
+              <w:rPr>
+                <w:noProof/>
+              </w:rPr>
               <w:fldChar w:fldCharType="separate"/>
+            </w:r>
+            <w:r>
+              <w:rPr>
+                <w:noProof/>
+              </w:rPr>
               <w:t>11</w:t>
+            </w:r>
+            <w:r>
+              <w:rPr>
+                <w:noProof/>
+              </w:rPr>
               <w:fldChar w:fldCharType="end"/>
             </w:r>
           </w:hyperlink>
@@ -1729,10 +2691,40 @@
                 <w:noProof/>
               </w:rPr>
               <w:tab/>
+            </w:r>
+            <w:r>
+              <w:rPr>
+                <w:noProof/>
+              </w:rPr>
               <w:fldChar w:fldCharType="begin"/>
+            </w:r>
+            <w:r>
+              <w:rPr>
+                <w:noProof/>
+              </w:rPr>
               <w:instrText xml:space="preserve"> PAGEREF _Toc226195280 \h </w:instrText>
+            </w:r>
+            <w:r>
+              <w:rPr>
+                <w:noProof/>
+              </w:rPr>
+            </w:r>
+            <w:r>
+              <w:rPr>
+                <w:noProof/>
+              </w:rPr>
               <w:fldChar w:fldCharType="separate"/>
+            </w:r>
+            <w:r>
+              <w:rPr>
+                <w:noProof/>
+              </w:rPr>
               <w:t>12</w:t>
+            </w:r>
+            <w:r>
+              <w:rPr>
+                <w:noProof/>
+              </w:rPr>
               <w:fldChar w:fldCharType="end"/>
             </w:r>
           </w:hyperlink>
@@ -1760,10 +2752,40 @@
                 <w:noProof/>
               </w:rPr>
               <w:tab/>
+            </w:r>
+            <w:r>
+              <w:rPr>
+                <w:noProof/>
+              </w:rPr>
               <w:fldChar w:fldCharType="begin"/>
+            </w:r>
+            <w:r>
+              <w:rPr>
+                <w:noProof/>
+              </w:rPr>
               <w:instrText xml:space="preserve"> PAGEREF _Toc226195281 \h </w:instrText>
+            </w:r>
+            <w:r>
+              <w:rPr>
+                <w:noProof/>
+              </w:rPr>
+            </w:r>
+            <w:r>
+              <w:rPr>
+                <w:noProof/>
+              </w:rPr>
               <w:fldChar w:fldCharType="separate"/>
+            </w:r>
+            <w:r>
+              <w:rPr>
+                <w:noProof/>
+              </w:rPr>
               <w:t>12</w:t>
+            </w:r>
+            <w:r>
+              <w:rPr>
+                <w:noProof/>
+              </w:rPr>
               <w:fldChar w:fldCharType="end"/>
             </w:r>
           </w:hyperlink>
@@ -1791,10 +2813,40 @@
                 <w:noProof/>
               </w:rPr>
               <w:tab/>
+            </w:r>
+            <w:r>
+              <w:rPr>
+                <w:noProof/>
+              </w:rPr>
               <w:fldChar w:fldCharType="begin"/>
+            </w:r>
+            <w:r>
+              <w:rPr>
+                <w:noProof/>
+              </w:rPr>
               <w:instrText xml:space="preserve"> PAGEREF _Toc226195282 \h </w:instrText>
+            </w:r>
+            <w:r>
+              <w:rPr>
+                <w:noProof/>
+              </w:rPr>
+            </w:r>
+            <w:r>
+              <w:rPr>
+                <w:noProof/>
+              </w:rPr>
               <w:fldChar w:fldCharType="separate"/>
+            </w:r>
+            <w:r>
+              <w:rPr>
+                <w:noProof/>
+              </w:rPr>
               <w:t>12</w:t>
+            </w:r>
+            <w:r>
+              <w:rPr>
+                <w:noProof/>
+              </w:rPr>
               <w:fldChar w:fldCharType="end"/>
             </w:r>
           </w:hyperlink>
@@ -1822,10 +2874,40 @@
                 <w:noProof/>
               </w:rPr>
               <w:tab/>
+            </w:r>
+            <w:r>
+              <w:rPr>
+                <w:noProof/>
+              </w:rPr>
               <w:fldChar w:fldCharType="begin"/>
+            </w:r>
+            <w:r>
+              <w:rPr>
+                <w:noProof/>
+              </w:rPr>
               <w:instrText xml:space="preserve"> PAGEREF _Toc226195283 \h </w:instrText>
+            </w:r>
+            <w:r>
+              <w:rPr>
+                <w:noProof/>
+              </w:rPr>
+            </w:r>
+            <w:r>
+              <w:rPr>
+                <w:noProof/>
+              </w:rPr>
               <w:fldChar w:fldCharType="separate"/>
+            </w:r>
+            <w:r>
+              <w:rPr>
+                <w:noProof/>
+              </w:rPr>
               <w:t>13</w:t>
+            </w:r>
+            <w:r>
+              <w:rPr>
+                <w:noProof/>
+              </w:rPr>
               <w:fldChar w:fldCharType="end"/>
             </w:r>
           </w:hyperlink>
@@ -1853,10 +2935,40 @@
                 <w:noProof/>
               </w:rPr>
               <w:tab/>
+            </w:r>
+            <w:r>
+              <w:rPr>
+                <w:noProof/>
+              </w:rPr>
               <w:fldChar w:fldCharType="begin"/>
+            </w:r>
+            <w:r>
+              <w:rPr>
+                <w:noProof/>
+              </w:rPr>
               <w:instrText xml:space="preserve"> PAGEREF _Toc226195284 \h </w:instrText>
+            </w:r>
+            <w:r>
+              <w:rPr>
+                <w:noProof/>
+              </w:rPr>
+            </w:r>
+            <w:r>
+              <w:rPr>
+                <w:noProof/>
+              </w:rPr>
               <w:fldChar w:fldCharType="separate"/>
+            </w:r>
+            <w:r>
+              <w:rPr>
+                <w:noProof/>
+              </w:rPr>
               <w:t>13</w:t>
+            </w:r>
+            <w:r>
+              <w:rPr>
+                <w:noProof/>
+              </w:rPr>
               <w:fldChar w:fldCharType="end"/>
             </w:r>
           </w:hyperlink>
@@ -1884,10 +2996,40 @@
                 <w:noProof/>
               </w:rPr>
               <w:tab/>
+            </w:r>
+            <w:r>
+              <w:rPr>
+                <w:noProof/>
+              </w:rPr>
               <w:fldChar w:fldCharType="begin"/>
+            </w:r>
+            <w:r>
+              <w:rPr>
+                <w:noProof/>
+              </w:rPr>
               <w:instrText xml:space="preserve"> PAGEREF _Toc226195285 \h </w:instrText>
+            </w:r>
+            <w:r>
+              <w:rPr>
+                <w:noProof/>
+              </w:rPr>
+            </w:r>
+            <w:r>
+              <w:rPr>
+                <w:noProof/>
+              </w:rPr>
               <w:fldChar w:fldCharType="separate"/>
+            </w:r>
+            <w:r>
+              <w:rPr>
+                <w:noProof/>
+              </w:rPr>
               <w:t>13</w:t>
+            </w:r>
+            <w:r>
+              <w:rPr>
+                <w:noProof/>
+              </w:rPr>
               <w:fldChar w:fldCharType="end"/>
             </w:r>
           </w:hyperlink>
@@ -1915,10 +3057,40 @@
                 <w:noProof/>
               </w:rPr>
               <w:tab/>
+            </w:r>
+            <w:r>
+              <w:rPr>
+                <w:noProof/>
+              </w:rPr>
               <w:fldChar w:fldCharType="begin"/>
+            </w:r>
+            <w:r>
+              <w:rPr>
+                <w:noProof/>
+              </w:rPr>
               <w:instrText xml:space="preserve"> PAGEREF _Toc226195286 \h </w:instrText>
+            </w:r>
+            <w:r>
+              <w:rPr>
+                <w:noProof/>
+              </w:rPr>
+            </w:r>
+            <w:r>
+              <w:rPr>
+                <w:noProof/>
+              </w:rPr>
               <w:fldChar w:fldCharType="separate"/>
+            </w:r>
+            <w:r>
+              <w:rPr>
+                <w:noProof/>
+              </w:rPr>
               <w:t>13</w:t>
+            </w:r>
+            <w:r>
+              <w:rPr>
+                <w:noProof/>
+              </w:rPr>
               <w:fldChar w:fldCharType="end"/>
             </w:r>
           </w:hyperlink>
@@ -1946,10 +3118,40 @@
                 <w:noProof/>
               </w:rPr>
               <w:tab/>
+            </w:r>
+            <w:r>
+              <w:rPr>
+                <w:noProof/>
+              </w:rPr>
               <w:fldChar w:fldCharType="begin"/>
+            </w:r>
+            <w:r>
+              <w:rPr>
+                <w:noProof/>
+              </w:rPr>
               <w:instrText xml:space="preserve"> PAGEREF _Toc226195287 \h </w:instrText>
+            </w:r>
+            <w:r>
+              <w:rPr>
+                <w:noProof/>
+              </w:rPr>
+            </w:r>
+            <w:r>
+              <w:rPr>
+                <w:noProof/>
+              </w:rPr>
               <w:fldChar w:fldCharType="separate"/>
+            </w:r>
+            <w:r>
+              <w:rPr>
+                <w:noProof/>
+              </w:rPr>
               <w:t>14</w:t>
+            </w:r>
+            <w:r>
+              <w:rPr>
+                <w:noProof/>
+              </w:rPr>
               <w:fldChar w:fldCharType="end"/>
             </w:r>
           </w:hyperlink>
@@ -1977,10 +3179,40 @@
                 <w:noProof/>
               </w:rPr>
               <w:tab/>
+            </w:r>
+            <w:r>
+              <w:rPr>
+                <w:noProof/>
+              </w:rPr>
               <w:fldChar w:fldCharType="begin"/>
+            </w:r>
+            <w:r>
+              <w:rPr>
+                <w:noProof/>
+              </w:rPr>
               <w:instrText xml:space="preserve"> PAGEREF _Toc226195288 \h </w:instrText>
+            </w:r>
+            <w:r>
+              <w:rPr>
+                <w:noProof/>
+              </w:rPr>
+            </w:r>
+            <w:r>
+              <w:rPr>
+                <w:noProof/>
+              </w:rPr>
               <w:fldChar w:fldCharType="separate"/>
+            </w:r>
+            <w:r>
+              <w:rPr>
+                <w:noProof/>
+              </w:rPr>
               <w:t>14</w:t>
+            </w:r>
+            <w:r>
+              <w:rPr>
+                <w:noProof/>
+              </w:rPr>
               <w:fldChar w:fldCharType="end"/>
             </w:r>
           </w:hyperlink>
@@ -2008,10 +3240,40 @@
                 <w:noProof/>
               </w:rPr>
               <w:tab/>
+            </w:r>
+            <w:r>
+              <w:rPr>
+                <w:noProof/>
+              </w:rPr>
               <w:fldChar w:fldCharType="begin"/>
+            </w:r>
+            <w:r>
+              <w:rPr>
+                <w:noProof/>
+              </w:rPr>
               <w:instrText xml:space="preserve"> PAGEREF _Toc226195289 \h </w:instrText>
+            </w:r>
+            <w:r>
+              <w:rPr>
+                <w:noProof/>
+              </w:rPr>
+            </w:r>
+            <w:r>
+              <w:rPr>
+                <w:noProof/>
+              </w:rPr>
               <w:fldChar w:fldCharType="separate"/>
+            </w:r>
+            <w:r>
+              <w:rPr>
+                <w:noProof/>
+              </w:rPr>
               <w:t>14</w:t>
+            </w:r>
+            <w:r>
+              <w:rPr>
+                <w:noProof/>
+              </w:rPr>
               <w:fldChar w:fldCharType="end"/>
             </w:r>
           </w:hyperlink>
@@ -2039,10 +3301,40 @@
                 <w:noProof/>
               </w:rPr>
               <w:tab/>
+            </w:r>
+            <w:r>
+              <w:rPr>
+                <w:noProof/>
+              </w:rPr>
               <w:fldChar w:fldCharType="begin"/>
+            </w:r>
+            <w:r>
+              <w:rPr>
+                <w:noProof/>
+              </w:rPr>
               <w:instrText xml:space="preserve"> PAGEREF _Toc226195290 \h </w:instrText>
+            </w:r>
+            <w:r>
+              <w:rPr>
+                <w:noProof/>
+              </w:rPr>
+            </w:r>
+            <w:r>
+              <w:rPr>
+                <w:noProof/>
+              </w:rPr>
               <w:fldChar w:fldCharType="separate"/>
+            </w:r>
+            <w:r>
+              <w:rPr>
+                <w:noProof/>
+              </w:rPr>
               <w:t>14</w:t>
+            </w:r>
+            <w:r>
+              <w:rPr>
+                <w:noProof/>
+              </w:rPr>
               <w:fldChar w:fldCharType="end"/>
             </w:r>
           </w:hyperlink>
@@ -2070,10 +3362,40 @@
                 <w:noProof/>
               </w:rPr>
               <w:tab/>
+            </w:r>
+            <w:r>
+              <w:rPr>
+                <w:noProof/>
+              </w:rPr>
               <w:fldChar w:fldCharType="begin"/>
+            </w:r>
+            <w:r>
+              <w:rPr>
+                <w:noProof/>
+              </w:rPr>
               <w:instrText xml:space="preserve"> PAGEREF _Toc226195291 \h </w:instrText>
+            </w:r>
+            <w:r>
+              <w:rPr>
+                <w:noProof/>
+              </w:rPr>
+            </w:r>
+            <w:r>
+              <w:rPr>
+                <w:noProof/>
+              </w:rPr>
               <w:fldChar w:fldCharType="separate"/>
+            </w:r>
+            <w:r>
+              <w:rPr>
+                <w:noProof/>
+              </w:rPr>
               <w:t>14</w:t>
+            </w:r>
+            <w:r>
+              <w:rPr>
+                <w:noProof/>
+              </w:rPr>
               <w:fldChar w:fldCharType="end"/>
             </w:r>
           </w:hyperlink>
@@ -2101,10 +3423,40 @@
                 <w:noProof/>
               </w:rPr>
               <w:tab/>
+            </w:r>
+            <w:r>
+              <w:rPr>
+                <w:noProof/>
+              </w:rPr>
               <w:fldChar w:fldCharType="begin"/>
+            </w:r>
+            <w:r>
+              <w:rPr>
+                <w:noProof/>
+              </w:rPr>
               <w:instrText xml:space="preserve"> PAGEREF _Toc226195292 \h </w:instrText>
+            </w:r>
+            <w:r>
+              <w:rPr>
+                <w:noProof/>
+              </w:rPr>
+            </w:r>
+            <w:r>
+              <w:rPr>
+                <w:noProof/>
+              </w:rPr>
               <w:fldChar w:fldCharType="separate"/>
+            </w:r>
+            <w:r>
+              <w:rPr>
+                <w:noProof/>
+              </w:rPr>
               <w:t>14</w:t>
+            </w:r>
+            <w:r>
+              <w:rPr>
+                <w:noProof/>
+              </w:rPr>
               <w:fldChar w:fldCharType="end"/>
             </w:r>
           </w:hyperlink>
@@ -2132,10 +3484,40 @@
                 <w:noProof/>
               </w:rPr>
               <w:tab/>
+            </w:r>
+            <w:r>
+              <w:rPr>
+                <w:noProof/>
+              </w:rPr>
               <w:fldChar w:fldCharType="begin"/>
+            </w:r>
+            <w:r>
+              <w:rPr>
+                <w:noProof/>
+              </w:rPr>
               <w:instrText xml:space="preserve"> PAGEREF _Toc226195293 \h </w:instrText>
+            </w:r>
+            <w:r>
+              <w:rPr>
+                <w:noProof/>
+              </w:rPr>
+            </w:r>
+            <w:r>
+              <w:rPr>
+                <w:noProof/>
+              </w:rPr>
               <w:fldChar w:fldCharType="separate"/>
+            </w:r>
+            <w:r>
+              <w:rPr>
+                <w:noProof/>
+              </w:rPr>
               <w:t>14</w:t>
+            </w:r>
+            <w:r>
+              <w:rPr>
+                <w:noProof/>
+              </w:rPr>
               <w:fldChar w:fldCharType="end"/>
             </w:r>
           </w:hyperlink>
@@ -2163,10 +3545,40 @@
                 <w:noProof/>
               </w:rPr>
               <w:tab/>
+            </w:r>
+            <w:r>
+              <w:rPr>
+                <w:noProof/>
+              </w:rPr>
               <w:fldChar w:fldCharType="begin"/>
+            </w:r>
+            <w:r>
+              <w:rPr>
+                <w:noProof/>
+              </w:rPr>
               <w:instrText xml:space="preserve"> PAGEREF _Toc226195294 \h </w:instrText>
+            </w:r>
+            <w:r>
+              <w:rPr>
+                <w:noProof/>
+              </w:rPr>
+            </w:r>
+            <w:r>
+              <w:rPr>
+                <w:noProof/>
+              </w:rPr>
               <w:fldChar w:fldCharType="separate"/>
+            </w:r>
+            <w:r>
+              <w:rPr>
+                <w:noProof/>
+              </w:rPr>
               <w:t>14</w:t>
+            </w:r>
+            <w:r>
+              <w:rPr>
+                <w:noProof/>
+              </w:rPr>
               <w:fldChar w:fldCharType="end"/>
             </w:r>
           </w:hyperlink>
@@ -2194,10 +3606,40 @@
                 <w:noProof/>
               </w:rPr>
               <w:tab/>
+            </w:r>
+            <w:r>
+              <w:rPr>
+                <w:noProof/>
+              </w:rPr>
               <w:fldChar w:fldCharType="begin"/>
+            </w:r>
+            <w:r>
+              <w:rPr>
+                <w:noProof/>
+              </w:rPr>
               <w:instrText xml:space="preserve"> PAGEREF _Toc226195295 \h </w:instrText>
+            </w:r>
+            <w:r>
+              <w:rPr>
+                <w:noProof/>
+              </w:rPr>
+            </w:r>
+            <w:r>
+              <w:rPr>
+                <w:noProof/>
+              </w:rPr>
               <w:fldChar w:fldCharType="separate"/>
+            </w:r>
+            <w:r>
+              <w:rPr>
+                <w:noProof/>
+              </w:rPr>
               <w:t>14</w:t>
+            </w:r>
+            <w:r>
+              <w:rPr>
+                <w:noProof/>
+              </w:rPr>
               <w:fldChar w:fldCharType="end"/>
             </w:r>
           </w:hyperlink>
@@ -2225,10 +3667,40 @@
                 <w:noProof/>
               </w:rPr>
               <w:tab/>
+            </w:r>
+            <w:r>
+              <w:rPr>
+                <w:noProof/>
+              </w:rPr>
               <w:fldChar w:fldCharType="begin"/>
+            </w:r>
+            <w:r>
+              <w:rPr>
+                <w:noProof/>
+              </w:rPr>
               <w:instrText xml:space="preserve"> PAGEREF _Toc226195296 \h </w:instrText>
+            </w:r>
+            <w:r>
+              <w:rPr>
+                <w:noProof/>
+              </w:rPr>
+            </w:r>
+            <w:r>
+              <w:rPr>
+                <w:noProof/>
+              </w:rPr>
               <w:fldChar w:fldCharType="separate"/>
+            </w:r>
+            <w:r>
+              <w:rPr>
+                <w:noProof/>
+              </w:rPr>
               <w:t>14</w:t>
+            </w:r>
+            <w:r>
+              <w:rPr>
+                <w:noProof/>
+              </w:rPr>
               <w:fldChar w:fldCharType="end"/>
             </w:r>
           </w:hyperlink>
@@ -2256,10 +3728,40 @@
                 <w:noProof/>
               </w:rPr>
               <w:tab/>
+            </w:r>
+            <w:r>
+              <w:rPr>
+                <w:noProof/>
+              </w:rPr>
               <w:fldChar w:fldCharType="begin"/>
+            </w:r>
+            <w:r>
+              <w:rPr>
+                <w:noProof/>
+              </w:rPr>
               <w:instrText xml:space="preserve"> PAGEREF _Toc226195297 \h </w:instrText>
+            </w:r>
+            <w:r>
+              <w:rPr>
+                <w:noProof/>
+              </w:rPr>
+            </w:r>
+            <w:r>
+              <w:rPr>
+                <w:noProof/>
+              </w:rPr>
               <w:fldChar w:fldCharType="separate"/>
+            </w:r>
+            <w:r>
+              <w:rPr>
+                <w:noProof/>
+              </w:rPr>
               <w:t>15</w:t>
+            </w:r>
+            <w:r>
+              <w:rPr>
+                <w:noProof/>
+              </w:rPr>
               <w:fldChar w:fldCharType="end"/>
             </w:r>
           </w:hyperlink>
@@ -2287,10 +3789,40 @@
                 <w:noProof/>
               </w:rPr>
               <w:tab/>
+            </w:r>
+            <w:r>
+              <w:rPr>
+                <w:noProof/>
+              </w:rPr>
               <w:fldChar w:fldCharType="begin"/>
+            </w:r>
+            <w:r>
+              <w:rPr>
+                <w:noProof/>
+              </w:rPr>
               <w:instrText xml:space="preserve"> PAGEREF _Toc226195298 \h </w:instrText>
+            </w:r>
+            <w:r>
+              <w:rPr>
+                <w:noProof/>
+              </w:rPr>
+            </w:r>
+            <w:r>
+              <w:rPr>
+                <w:noProof/>
+              </w:rPr>
               <w:fldChar w:fldCharType="separate"/>
+            </w:r>
+            <w:r>
+              <w:rPr>
+                <w:noProof/>
+              </w:rPr>
               <w:t>16</w:t>
+            </w:r>
+            <w:r>
+              <w:rPr>
+                <w:noProof/>
+              </w:rPr>
               <w:fldChar w:fldCharType="end"/>
             </w:r>
           </w:hyperlink>
@@ -2318,10 +3850,40 @@
                 <w:noProof/>
               </w:rPr>
               <w:tab/>
+            </w:r>
+            <w:r>
+              <w:rPr>
+                <w:noProof/>
+              </w:rPr>
               <w:fldChar w:fldCharType="begin"/>
+            </w:r>
+            <w:r>
+              <w:rPr>
+                <w:noProof/>
+              </w:rPr>
               <w:instrText xml:space="preserve"> PAGEREF _Toc226195299 \h </w:instrText>
+            </w:r>
+            <w:r>
+              <w:rPr>
+                <w:noProof/>
+              </w:rPr>
+            </w:r>
+            <w:r>
+              <w:rPr>
+                <w:noProof/>
+              </w:rPr>
               <w:fldChar w:fldCharType="separate"/>
+            </w:r>
+            <w:r>
+              <w:rPr>
+                <w:noProof/>
+              </w:rPr>
               <w:t>16</w:t>
+            </w:r>
+            <w:r>
+              <w:rPr>
+                <w:noProof/>
+              </w:rPr>
               <w:fldChar w:fldCharType="end"/>
             </w:r>
           </w:hyperlink>
@@ -2349,10 +3911,40 @@
                 <w:noProof/>
               </w:rPr>
               <w:tab/>
+            </w:r>
+            <w:r>
+              <w:rPr>
+                <w:noProof/>
+              </w:rPr>
               <w:fldChar w:fldCharType="begin"/>
+            </w:r>
+            <w:r>
+              <w:rPr>
+                <w:noProof/>
+              </w:rPr>
               <w:instrText xml:space="preserve"> PAGEREF _Toc226195300 \h </w:instrText>
+            </w:r>
+            <w:r>
+              <w:rPr>
+                <w:noProof/>
+              </w:rPr>
+            </w:r>
+            <w:r>
+              <w:rPr>
+                <w:noProof/>
+              </w:rPr>
               <w:fldChar w:fldCharType="separate"/>
+            </w:r>
+            <w:r>
+              <w:rPr>
+                <w:noProof/>
+              </w:rPr>
               <w:t>16</w:t>
+            </w:r>
+            <w:r>
+              <w:rPr>
+                <w:noProof/>
+              </w:rPr>
               <w:fldChar w:fldCharType="end"/>
             </w:r>
           </w:hyperlink>
@@ -2380,10 +3972,40 @@
                 <w:noProof/>
               </w:rPr>
               <w:tab/>
+            </w:r>
+            <w:r>
+              <w:rPr>
+                <w:noProof/>
+              </w:rPr>
               <w:fldChar w:fldCharType="begin"/>
+            </w:r>
+            <w:r>
+              <w:rPr>
+                <w:noProof/>
+              </w:rPr>
               <w:instrText xml:space="preserve"> PAGEREF _Toc226195301 \h </w:instrText>
+            </w:r>
+            <w:r>
+              <w:rPr>
+                <w:noProof/>
+              </w:rPr>
+            </w:r>
+            <w:r>
+              <w:rPr>
+                <w:noProof/>
+              </w:rPr>
               <w:fldChar w:fldCharType="separate"/>
+            </w:r>
+            <w:r>
+              <w:rPr>
+                <w:noProof/>
+              </w:rPr>
               <w:t>16</w:t>
+            </w:r>
+            <w:r>
+              <w:rPr>
+                <w:noProof/>
+              </w:rPr>
               <w:fldChar w:fldCharType="end"/>
             </w:r>
           </w:hyperlink>
@@ -2411,10 +4033,40 @@
                 <w:noProof/>
               </w:rPr>
               <w:tab/>
+            </w:r>
+            <w:r>
+              <w:rPr>
+                <w:noProof/>
+              </w:rPr>
               <w:fldChar w:fldCharType="begin"/>
+            </w:r>
+            <w:r>
+              <w:rPr>
+                <w:noProof/>
+              </w:rPr>
               <w:instrText xml:space="preserve"> PAGEREF _Toc226195302 \h </w:instrText>
+            </w:r>
+            <w:r>
+              <w:rPr>
+                <w:noProof/>
+              </w:rPr>
+            </w:r>
+            <w:r>
+              <w:rPr>
+                <w:noProof/>
+              </w:rPr>
               <w:fldChar w:fldCharType="separate"/>
+            </w:r>
+            <w:r>
+              <w:rPr>
+                <w:noProof/>
+              </w:rPr>
               <w:t>16</w:t>
+            </w:r>
+            <w:r>
+              <w:rPr>
+                <w:noProof/>
+              </w:rPr>
               <w:fldChar w:fldCharType="end"/>
             </w:r>
           </w:hyperlink>
@@ -2442,10 +4094,40 @@
                 <w:noProof/>
               </w:rPr>
               <w:tab/>
+            </w:r>
+            <w:r>
+              <w:rPr>
+                <w:noProof/>
+              </w:rPr>
               <w:fldChar w:fldCharType="begin"/>
+            </w:r>
+            <w:r>
+              <w:rPr>
+                <w:noProof/>
+              </w:rPr>
               <w:instrText xml:space="preserve"> PAGEREF _Toc226195303 \h </w:instrText>
+            </w:r>
+            <w:r>
+              <w:rPr>
+                <w:noProof/>
+              </w:rPr>
+            </w:r>
+            <w:r>
+              <w:rPr>
+                <w:noProof/>
+              </w:rPr>
               <w:fldChar w:fldCharType="separate"/>
+            </w:r>
+            <w:r>
+              <w:rPr>
+                <w:noProof/>
+              </w:rPr>
               <w:t>16</w:t>
+            </w:r>
+            <w:r>
+              <w:rPr>
+                <w:noProof/>
+              </w:rPr>
               <w:fldChar w:fldCharType="end"/>
             </w:r>
           </w:hyperlink>
@@ -2473,10 +4155,40 @@
                 <w:noProof/>
               </w:rPr>
               <w:tab/>
+            </w:r>
+            <w:r>
+              <w:rPr>
+                <w:noProof/>
+              </w:rPr>
               <w:fldChar w:fldCharType="begin"/>
+            </w:r>
+            <w:r>
+              <w:rPr>
+                <w:noProof/>
+              </w:rPr>
               <w:instrText xml:space="preserve"> PAGEREF _Toc226195304 \h </w:instrText>
+            </w:r>
+            <w:r>
+              <w:rPr>
+                <w:noProof/>
+              </w:rPr>
+            </w:r>
+            <w:r>
+              <w:rPr>
+                <w:noProof/>
+              </w:rPr>
               <w:fldChar w:fldCharType="separate"/>
+            </w:r>
+            <w:r>
+              <w:rPr>
+                <w:noProof/>
+              </w:rPr>
               <w:t>16</w:t>
+            </w:r>
+            <w:r>
+              <w:rPr>
+                <w:noProof/>
+              </w:rPr>
               <w:fldChar w:fldCharType="end"/>
             </w:r>
           </w:hyperlink>
@@ -2504,10 +4216,40 @@
                 <w:noProof/>
               </w:rPr>
               <w:tab/>
+            </w:r>
+            <w:r>
+              <w:rPr>
+                <w:noProof/>
+              </w:rPr>
               <w:fldChar w:fldCharType="begin"/>
+            </w:r>
+            <w:r>
+              <w:rPr>
+                <w:noProof/>
+              </w:rPr>
               <w:instrText xml:space="preserve"> PAGEREF _Toc226195305 \h </w:instrText>
+            </w:r>
+            <w:r>
+              <w:rPr>
+                <w:noProof/>
+              </w:rPr>
+            </w:r>
+            <w:r>
+              <w:rPr>
+                <w:noProof/>
+              </w:rPr>
               <w:fldChar w:fldCharType="separate"/>
+            </w:r>
+            <w:r>
+              <w:rPr>
+                <w:noProof/>
+              </w:rPr>
               <w:t>17</w:t>
+            </w:r>
+            <w:r>
+              <w:rPr>
+                <w:noProof/>
+              </w:rPr>
               <w:fldChar w:fldCharType="end"/>
             </w:r>
           </w:hyperlink>
@@ -2535,10 +4277,40 @@
                 <w:noProof/>
               </w:rPr>
               <w:tab/>
+            </w:r>
+            <w:r>
+              <w:rPr>
+                <w:noProof/>
+              </w:rPr>
               <w:fldChar w:fldCharType="begin"/>
+            </w:r>
+            <w:r>
+              <w:rPr>
+                <w:noProof/>
+              </w:rPr>
               <w:instrText xml:space="preserve"> PAGEREF _Toc226195306 \h </w:instrText>
+            </w:r>
+            <w:r>
+              <w:rPr>
+                <w:noProof/>
+              </w:rPr>
+            </w:r>
+            <w:r>
+              <w:rPr>
+                <w:noProof/>
+              </w:rPr>
               <w:fldChar w:fldCharType="separate"/>
+            </w:r>
+            <w:r>
+              <w:rPr>
+                <w:noProof/>
+              </w:rPr>
               <w:t>17</w:t>
+            </w:r>
+            <w:r>
+              <w:rPr>
+                <w:noProof/>
+              </w:rPr>
               <w:fldChar w:fldCharType="end"/>
             </w:r>
           </w:hyperlink>
@@ -2566,10 +4338,40 @@
                 <w:noProof/>
               </w:rPr>
               <w:tab/>
+            </w:r>
+            <w:r>
+              <w:rPr>
+                <w:noProof/>
+              </w:rPr>
               <w:fldChar w:fldCharType="begin"/>
+            </w:r>
+            <w:r>
+              <w:rPr>
+                <w:noProof/>
+              </w:rPr>
               <w:instrText xml:space="preserve"> PAGEREF _Toc226195307 \h </w:instrText>
+            </w:r>
+            <w:r>
+              <w:rPr>
+                <w:noProof/>
+              </w:rPr>
+            </w:r>
+            <w:r>
+              <w:rPr>
+                <w:noProof/>
+              </w:rPr>
               <w:fldChar w:fldCharType="separate"/>
+            </w:r>
+            <w:r>
+              <w:rPr>
+                <w:noProof/>
+              </w:rPr>
               <w:t>18</w:t>
+            </w:r>
+            <w:r>
+              <w:rPr>
+                <w:noProof/>
+              </w:rPr>
               <w:fldChar w:fldCharType="end"/>
             </w:r>
           </w:hyperlink>
@@ -2597,10 +4399,40 @@
                 <w:noProof/>
               </w:rPr>
               <w:tab/>
+            </w:r>
+            <w:r>
+              <w:rPr>
+                <w:noProof/>
+              </w:rPr>
               <w:fldChar w:fldCharType="begin"/>
+            </w:r>
+            <w:r>
+              <w:rPr>
+                <w:noProof/>
+              </w:rPr>
               <w:instrText xml:space="preserve"> PAGEREF _Toc226195308 \h </w:instrText>
+            </w:r>
+            <w:r>
+              <w:rPr>
+                <w:noProof/>
+              </w:rPr>
+            </w:r>
+            <w:r>
+              <w:rPr>
+                <w:noProof/>
+              </w:rPr>
               <w:fldChar w:fldCharType="separate"/>
+            </w:r>
+            <w:r>
+              <w:rPr>
+                <w:noProof/>
+              </w:rPr>
               <w:t>18</w:t>
+            </w:r>
+            <w:r>
+              <w:rPr>
+                <w:noProof/>
+              </w:rPr>
               <w:fldChar w:fldCharType="end"/>
             </w:r>
           </w:hyperlink>
@@ -2628,10 +4460,40 @@
                 <w:noProof/>
               </w:rPr>
               <w:tab/>
+            </w:r>
+            <w:r>
+              <w:rPr>
+                <w:noProof/>
+              </w:rPr>
               <w:fldChar w:fldCharType="begin"/>
+            </w:r>
+            <w:r>
+              <w:rPr>
+                <w:noProof/>
+              </w:rPr>
               <w:instrText xml:space="preserve"> PAGEREF _Toc226195309 \h </w:instrText>
+            </w:r>
+            <w:r>
+              <w:rPr>
+                <w:noProof/>
+              </w:rPr>
+            </w:r>
+            <w:r>
+              <w:rPr>
+                <w:noProof/>
+              </w:rPr>
               <w:fldChar w:fldCharType="separate"/>
+            </w:r>
+            <w:r>
+              <w:rPr>
+                <w:noProof/>
+              </w:rPr>
               <w:t>18</w:t>
+            </w:r>
+            <w:r>
+              <w:rPr>
+                <w:noProof/>
+              </w:rPr>
               <w:fldChar w:fldCharType="end"/>
             </w:r>
           </w:hyperlink>
@@ -2659,10 +4521,40 @@
                 <w:noProof/>
               </w:rPr>
               <w:tab/>
+            </w:r>
+            <w:r>
+              <w:rPr>
+                <w:noProof/>
+              </w:rPr>
               <w:fldChar w:fldCharType="begin"/>
+            </w:r>
+            <w:r>
+              <w:rPr>
+                <w:noProof/>
+              </w:rPr>
               <w:instrText xml:space="preserve"> PAGEREF _Toc226195310 \h </w:instrText>
+            </w:r>
+            <w:r>
+              <w:rPr>
+                <w:noProof/>
+              </w:rPr>
+            </w:r>
+            <w:r>
+              <w:rPr>
+                <w:noProof/>
+              </w:rPr>
               <w:fldChar w:fldCharType="separate"/>
+            </w:r>
+            <w:r>
+              <w:rPr>
+                <w:noProof/>
+              </w:rPr>
               <w:t>18</w:t>
+            </w:r>
+            <w:r>
+              <w:rPr>
+                <w:noProof/>
+              </w:rPr>
               <w:fldChar w:fldCharType="end"/>
             </w:r>
           </w:hyperlink>
@@ -2690,10 +4582,40 @@
                 <w:noProof/>
               </w:rPr>
               <w:tab/>
+            </w:r>
+            <w:r>
+              <w:rPr>
+                <w:noProof/>
+              </w:rPr>
               <w:fldChar w:fldCharType="begin"/>
+            </w:r>
+            <w:r>
+              <w:rPr>
+                <w:noProof/>
+              </w:rPr>
               <w:instrText xml:space="preserve"> PAGEREF _Toc226195311 \h </w:instrText>
+            </w:r>
+            <w:r>
+              <w:rPr>
+                <w:noProof/>
+              </w:rPr>
+            </w:r>
+            <w:r>
+              <w:rPr>
+                <w:noProof/>
+              </w:rPr>
               <w:fldChar w:fldCharType="separate"/>
+            </w:r>
+            <w:r>
+              <w:rPr>
+                <w:noProof/>
+              </w:rPr>
               <w:t>19</w:t>
+            </w:r>
+            <w:r>
+              <w:rPr>
+                <w:noProof/>
+              </w:rPr>
               <w:fldChar w:fldCharType="end"/>
             </w:r>
           </w:hyperlink>
@@ -6403,11 +8325,9 @@
       <w:pPr>
         <w:pStyle w:val="Kop2"/>
       </w:pPr>
-      <w:bookmarkStart w:id="90" w:name="_Toc226195290"/>
       <w:r>
         <w:t>Path 3: Visualize Data</w:t>
       </w:r>
-      <w:bookmarkEnd w:id="90"/>
     </w:p>
     <w:p>
       <w:pPr>
@@ -6480,7 +8400,11 @@
         <w:spacing w:after="120" w:line="276" w:lineRule="auto"/>
       </w:pPr>
       <w:r>
-        <w:t>Y-axis scale (Linear or Log₁₀): the semi-log view makes the terminal elimination phase linear, which is useful for identifying biphasic profiles or half-life estimation issues. When log scale is active and zero concentrations are present they are omitted from the plot and a note is shown.</w:t>
+        <w:t xml:space="preserve">Y-axis scale (Linear or Log₁₀): the semi-log view makes the terminal elimination phase linear, which is useful for identifying biphasic profiles or half-life estimation issues. When log </w:t>
+      </w:r>
+      <w:r>
+        <w:lastRenderedPageBreak/>
+        <w:t>scale is active and zero concentrations are present they are omitted from the plot and a note is shown.</w:t>
       </w:r>
     </w:p>
     <w:p>
@@ -6560,6 +8484,7 @@
         <w:pStyle w:val="Kop3"/>
       </w:pPr>
       <w:r>
+        <w:lastRenderedPageBreak/>
         <w:t>Interactive Preview vs. Static Export</w:t>
       </w:r>
     </w:p>
@@ -6696,17 +8621,16 @@
       <w:pPr>
         <w:pStyle w:val="Kop2"/>
       </w:pPr>
-      <w:bookmarkStart w:id="91" w:name="_Toc226195291"/>
       <w:r>
         <w:t>Path 4: Analyze One Subject at a Time</w:t>
       </w:r>
-      <w:bookmarkEnd w:id="91"/>
     </w:p>
     <w:p>
       <w:pPr>
         <w:spacing w:after="120" w:line="276" w:lineRule="auto"/>
       </w:pPr>
       <w:r>
+        <w:lastRenderedPageBreak/>
         <w:t>Step through individual profiles. Manual data entry available. Half-life inspector allows point adjustment. Downloads: CSV and Complete Analysis Record (zip with reproducibility script).</w:t>
       </w:r>
     </w:p>
@@ -6714,10 +8638,28 @@
       <w:pPr>
         <w:pStyle w:val="Kop2"/>
       </w:pPr>
-      <w:bookmarkStart w:id="27" w:name="_Toc226195276"/>
+      <w:bookmarkStart w:id="26" w:name="_Toc226195276"/>
       <w:r>
         <w:t>Path 5: Analyze All Subjects (Batch NCA)</w:t>
       </w:r>
+      <w:bookmarkEnd w:id="26"/>
+    </w:p>
+    <w:p>
+      <w:pPr>
+        <w:spacing w:after="120" w:line="276" w:lineRule="auto"/>
+      </w:pPr>
+      <w:r>
+        <w:t>Settings: route, dose (single or per-subject), steady-state, trapezoidal method, minimum R². Result tabs: concentration–time profiles, parameter table (expandable to 37 columns), summary statistics, individual grid (interactive, paginated, 12 subjects per page), half-life review. Downloads: CSV, Excel, Complete Analysis Record.</w:t>
+      </w:r>
+    </w:p>
+    <w:p>
+      <w:pPr>
+        <w:pStyle w:val="Kop2"/>
+      </w:pPr>
+      <w:bookmarkStart w:id="27" w:name="_Toc226195277"/>
+      <w:r>
+        <w:t>Path 6: Bioequivalence Testing</w:t>
+      </w:r>
       <w:bookmarkEnd w:id="27"/>
     </w:p>
     <w:p>
@@ -6725,16 +8667,16 @@
         <w:spacing w:after="120" w:line="276" w:lineRule="auto"/>
       </w:pPr>
       <w:r>
-        <w:t>Settings: route, dose (single or per-subject), steady-state, trapezoidal method, minimum R². Result tabs: concentration–time profiles, parameter table (expandable to 37 columns), summary statistics, individual grid (interactive, paginated, 12 subjects per page), half-life review. Downloads: CSV, Excel, Complete Analysis Record.</w:t>
+        <w:t>Runs NCA, then ANOVA, then 90% CI. Supports 5 designs: 2-period crossover, fixed-order crossover, 3-period crossover, replicate crossover, parallel. Fixed or mixed-effects model. Standard ABE only (80–125%). Downloads: Excel, CSV, Complete Analysis Record.</w:t>
       </w:r>
     </w:p>
     <w:p>
       <w:pPr>
         <w:pStyle w:val="Kop2"/>
       </w:pPr>
-      <w:bookmarkStart w:id="28" w:name="_Toc226195277"/>
-      <w:r>
-        <w:t>Path 6: Bioequivalence Testing</w:t>
+      <w:bookmarkStart w:id="28" w:name="_Toc226195278"/>
+      <w:r>
+        <w:t>Analysing Drug–Drug Interaction Studies</w:t>
       </w:r>
       <w:bookmarkEnd w:id="28"/>
     </w:p>
@@ -6743,16 +8685,16 @@
         <w:spacing w:after="120" w:line="276" w:lineRule="auto"/>
       </w:pPr>
       <w:r>
-        <w:t>Runs NCA, then ANOVA, then 90% CI. Supports 5 designs: 2-period crossover, fixed-order crossover, 3-period crossover, replicate crossover, parallel. Fixed or mixed-effects model. Standard ABE only (80–125%). Downloads: Excel, CSV, Complete Analysis Record.</w:t>
-      </w:r>
-    </w:p>
-    <w:p>
-      <w:pPr>
-        <w:pStyle w:val="Kop2"/>
-      </w:pPr>
-      <w:bookmarkStart w:id="29" w:name="_Toc226195278"/>
-      <w:r>
-        <w:t>Analysing Drug–Drug Interaction Studies</w:t>
+        <w:t>The app’s Bioequivalence Testing path can be used to analyse drug–drug interaction (DDI) studies because the statistical framework is the same: a crossover design comparing two conditions, analysed with an ANOVA model and a 90% confidence interval for the geometric mean ratio.</w:t>
+      </w:r>
+    </w:p>
+    <w:p>
+      <w:pPr>
+        <w:pStyle w:val="Kop3"/>
+      </w:pPr>
+      <w:bookmarkStart w:id="29" w:name="_Toc226195279"/>
+      <w:r>
+        <w:t>How to Set Up a DDI Analysis</w:t>
       </w:r>
       <w:bookmarkEnd w:id="29"/>
     </w:p>
@@ -6761,33 +8703,14 @@
         <w:spacing w:after="120" w:line="276" w:lineRule="auto"/>
       </w:pPr>
       <w:r>
-        <w:t>The app’s Bioequivalence Testing path can be used to analyse drug–drug interaction (DDI) studies because the statistical framework is the same: a crossover design comparing two conditions, analysed with an ANOVA model and a 90% confidence interval for the geometric mean ratio.</w:t>
-      </w:r>
-    </w:p>
-    <w:p>
-      <w:pPr>
-        <w:pStyle w:val="Kop3"/>
-      </w:pPr>
-      <w:bookmarkStart w:id="30" w:name="_Toc226195279"/>
-      <w:r>
-        <w:t>How to Set Up a DDI Analysis</w:t>
-      </w:r>
-      <w:bookmarkEnd w:id="30"/>
+        <w:t>Prepare your data as a crossover dataset (Scenario 4 or 5 in Part II). Label the Treatment column with the two conditions: the victim drug given alone and the victim drug given with the perpetrator. For example, use ‘Alone’ and ‘With Ketoconazole’ as treatment labels. Upload the data, map the columns, and select the appropriate crossover design in the Bioequivalence Testing settings.</w:t>
+      </w:r>
     </w:p>
     <w:p>
       <w:pPr>
         <w:spacing w:after="120" w:line="276" w:lineRule="auto"/>
       </w:pPr>
       <w:r>
-        <w:t>Prepare your data as a crossover dataset (Scenario 4 or 5 in Part II). Label the Treatment column with the two conditions: the victim drug given alone and the victim drug given with the perpetrator. For example, use ‘Alone’ and ‘With Ketoconazole’ as treatment labels. Upload the data, map the columns, and select the appropriate crossover design in the Bioequivalence Testing settings.</w:t>
-      </w:r>
-    </w:p>
-    <w:p>
-      <w:pPr>
-        <w:spacing w:after="120" w:line="276" w:lineRule="auto"/>
-      </w:pPr>
-      <w:r>
-        <w:lastRenderedPageBreak/>
         <w:t>Run the analysis. The app produces the geometric mean ratio and 90% confidence interval for C</w:t>
       </w:r>
       <w:r>
@@ -6804,11 +8727,11 @@
       <w:pPr>
         <w:pStyle w:val="Kop3"/>
       </w:pPr>
-      <w:bookmarkStart w:id="31" w:name="_Toc226195280"/>
+      <w:bookmarkStart w:id="30" w:name="_Toc226195280"/>
       <w:r>
         <w:t>Interpreting DDI Results</w:t>
       </w:r>
-      <w:bookmarkEnd w:id="31"/>
+      <w:bookmarkEnd w:id="30"/>
     </w:p>
     <w:p>
       <w:pPr>
@@ -6900,6 +8823,7 @@
           <w:sz w:val="20"/>
           <w:szCs w:val="20"/>
         </w:rPr>
+        <w:lastRenderedPageBreak/>
         <w:t>These thresholds are from the FDA and EMA DDI guidance documents. The classification is based on the point estimate of the AUC ratio, not the CI boundaries.</w:t>
       </w:r>
     </w:p>
@@ -6907,10 +8831,44 @@
       <w:pPr>
         <w:pStyle w:val="Kop3"/>
       </w:pPr>
-      <w:bookmarkStart w:id="32" w:name="_Toc226195281"/>
+      <w:bookmarkStart w:id="31" w:name="_Toc226195281"/>
       <w:r>
         <w:t>Practical Considerations</w:t>
       </w:r>
+      <w:bookmarkEnd w:id="31"/>
+    </w:p>
+    <w:p>
+      <w:pPr>
+        <w:spacing w:after="120" w:line="276" w:lineRule="auto"/>
+      </w:pPr>
+      <w:r>
+        <w:t>The app reports the ratio as Test/Reference (expressed as a percentage). In a DDI study, ‘Test’ is typically the combination (victim + perpetrator) and ‘Reference’ is the victim alone. A reported ratio of 350% means the perpetrator increased the victim’s AUC by a factor of 3.5. If your labels are reversed, the ratio will be the reciprocal.</w:t>
+      </w:r>
+    </w:p>
+    <w:p>
+      <w:pPr>
+        <w:spacing w:after="120" w:line="276" w:lineRule="auto"/>
+      </w:pPr>
+      <w:r>
+        <w:t>For fixed-order DDI studies (all subjects receive the victim alone first, then with the perpetrator), select ‘Fixed-order crossover’ as the design. The app uses a paired analysis, which is statistically appropriate but cannot separate period effects from the interaction effect.</w:t>
+      </w:r>
+    </w:p>
+    <w:p>
+      <w:pPr>
+        <w:spacing w:after="120" w:line="276" w:lineRule="auto"/>
+      </w:pPr>
+      <w:r>
+        <w:t>The app’s forest plot and CI table are directly usable for the DDI results section of a clinical study report or regulatory submission. The 90% CI boundaries are the values reported in DDI summary tables per FDA and EMA guidance.</w:t>
+      </w:r>
+    </w:p>
+    <w:p>
+      <w:pPr>
+        <w:pStyle w:val="Kop2"/>
+      </w:pPr>
+      <w:bookmarkStart w:id="32" w:name="_Toc226195282"/>
+      <w:r>
+        <w:t>Complete Analysis Record</w:t>
+      </w:r>
       <w:bookmarkEnd w:id="32"/>
     </w:p>
     <w:p>
@@ -6918,40 +8876,6 @@
         <w:spacing w:after="120" w:line="276" w:lineRule="auto"/>
       </w:pPr>
       <w:r>
-        <w:t>The app reports the ratio as Test/Reference (expressed as a percentage). In a DDI study, ‘Test’ is typically the combination (victim + perpetrator) and ‘Reference’ is the victim alone. A reported ratio of 350% means the perpetrator increased the victim’s AUC by a factor of 3.5. If your labels are reversed, the ratio will be the reciprocal.</w:t>
-      </w:r>
-    </w:p>
-    <w:p>
-      <w:pPr>
-        <w:spacing w:after="120" w:line="276" w:lineRule="auto"/>
-      </w:pPr>
-      <w:r>
-        <w:t>For fixed-order DDI studies (all subjects receive the victim alone first, then with the perpetrator), select ‘Fixed-order crossover’ as the design. The app uses a paired analysis, which is statistically appropriate but cannot separate period effects from the interaction effect.</w:t>
-      </w:r>
-    </w:p>
-    <w:p>
-      <w:pPr>
-        <w:spacing w:after="120" w:line="276" w:lineRule="auto"/>
-      </w:pPr>
-      <w:r>
-        <w:t>The app’s forest plot and CI table are directly usable for the DDI results section of a clinical study report or regulatory submission. The 90% CI boundaries are the values reported in DDI summary tables per FDA and EMA guidance.</w:t>
-      </w:r>
-    </w:p>
-    <w:p>
-      <w:pPr>
-        <w:pStyle w:val="Kop2"/>
-      </w:pPr>
-      <w:bookmarkStart w:id="33" w:name="_Toc226195282"/>
-      <w:r>
-        <w:t>Complete Analysis Record</w:t>
-      </w:r>
-      <w:bookmarkEnd w:id="33"/>
-    </w:p>
-    <w:p>
-      <w:pPr>
-        <w:spacing w:after="120" w:line="276" w:lineRule="auto"/>
-      </w:pPr>
-      <w:r>
         <w:t>Available in all three analysis paths (single-subject, batch NCA, and BE/DDI). Self-contained zip with: results.xlsx, analysis_settings.json, reproduce_analysis.R (standalone script), data_integrity.txt (SHA-256 hash), analysis_summary.html, and the original data file.</w:t>
       </w:r>
     </w:p>
@@ -6964,22 +8888,22 @@
       <w:pPr>
         <w:pStyle w:val="Kop1"/>
       </w:pPr>
-      <w:bookmarkStart w:id="34" w:name="_Toc226195283"/>
+      <w:bookmarkStart w:id="33" w:name="_Toc226195283"/>
       <w:r>
         <w:lastRenderedPageBreak/>
         <w:t>Part IV: Worked Examples</w:t>
       </w:r>
+      <w:bookmarkEnd w:id="33"/>
+    </w:p>
+    <w:p>
+      <w:pPr>
+        <w:pStyle w:val="Kop2"/>
+      </w:pPr>
+      <w:bookmarkStart w:id="34" w:name="_Toc226195284"/>
+      <w:r>
+        <w:t>Exercise 1: Theoph Dataset (Batch NCA)</w:t>
+      </w:r>
       <w:bookmarkEnd w:id="34"/>
-    </w:p>
-    <w:p>
-      <w:pPr>
-        <w:pStyle w:val="Kop2"/>
-      </w:pPr>
-      <w:bookmarkStart w:id="35" w:name="_Toc226195284"/>
-      <w:r>
-        <w:t>Exercise 1: Theoph Dataset (Batch NCA)</w:t>
-      </w:r>
-      <w:bookmarkEnd w:id="35"/>
     </w:p>
     <w:p>
       <w:pPr>
@@ -7070,11 +8994,11 @@
       <w:pPr>
         <w:pStyle w:val="Kop2"/>
       </w:pPr>
-      <w:bookmarkStart w:id="36" w:name="_Toc226195285"/>
+      <w:bookmarkStart w:id="35" w:name="_Toc226195285"/>
       <w:r>
         <w:t>Exercise 2: Bioequivalence</w:t>
       </w:r>
-      <w:bookmarkEnd w:id="36"/>
+      <w:bookmarkEnd w:id="35"/>
     </w:p>
     <w:p>
       <w:pPr>
@@ -7108,11 +9032,11 @@
       <w:pPr>
         <w:pStyle w:val="Kop2"/>
       </w:pPr>
-      <w:bookmarkStart w:id="37" w:name="_Toc226195286"/>
+      <w:bookmarkStart w:id="36" w:name="_Toc226195286"/>
       <w:r>
         <w:t>Exercise 3: Power Calculation</w:t>
       </w:r>
-      <w:bookmarkEnd w:id="37"/>
+      <w:bookmarkEnd w:id="36"/>
     </w:p>
     <w:p>
       <w:pPr>
@@ -7146,32 +9070,32 @@
       <w:pPr>
         <w:pStyle w:val="Kop1"/>
       </w:pPr>
-      <w:bookmarkStart w:id="38" w:name="_Toc226195287"/>
+      <w:bookmarkStart w:id="37" w:name="_Toc226195287"/>
       <w:r>
         <w:lastRenderedPageBreak/>
         <w:t>Part V: Theoretical Background</w:t>
       </w:r>
+      <w:bookmarkEnd w:id="37"/>
+    </w:p>
+    <w:p>
+      <w:pPr>
+        <w:pStyle w:val="Kop2"/>
+      </w:pPr>
+      <w:bookmarkStart w:id="38" w:name="_Toc226195288"/>
+      <w:r>
+        <w:t>Trapezoidal Methods for AUC Calculation</w:t>
+      </w:r>
       <w:bookmarkEnd w:id="38"/>
     </w:p>
     <w:p>
       <w:pPr>
-        <w:pStyle w:val="Kop2"/>
-      </w:pPr>
-      <w:bookmarkStart w:id="39" w:name="_Toc226195288"/>
-      <w:r>
-        <w:t>Trapezoidal Methods for AUC Calculation</w:t>
+        <w:pStyle w:val="Kop3"/>
+      </w:pPr>
+      <w:bookmarkStart w:id="39" w:name="_Toc226195289"/>
+      <w:r>
+        <w:t>The Linear Trapezoidal Rule</w:t>
       </w:r>
       <w:bookmarkEnd w:id="39"/>
-    </w:p>
-    <w:p>
-      <w:pPr>
-        <w:pStyle w:val="Kop3"/>
-      </w:pPr>
-      <w:bookmarkStart w:id="40" w:name="_Toc226195289"/>
-      <w:r>
-        <w:t>The Linear Trapezoidal Rule</w:t>
-      </w:r>
-      <w:bookmarkEnd w:id="40"/>
     </w:p>
     <w:p>
       <w:pPr>
@@ -7244,11 +9168,11 @@
       <w:pPr>
         <w:pStyle w:val="Kop3"/>
       </w:pPr>
-      <w:bookmarkStart w:id="41" w:name="_Toc226195290"/>
+      <w:bookmarkStart w:id="40" w:name="_Toc226195290"/>
       <w:r>
         <w:t>The Logarithmic Trapezoidal Rule</w:t>
       </w:r>
-      <w:bookmarkEnd w:id="41"/>
+      <w:bookmarkEnd w:id="40"/>
     </w:p>
     <w:p>
       <w:pPr>
@@ -7285,39 +9209,39 @@
       <w:pPr>
         <w:pStyle w:val="Kop3"/>
       </w:pPr>
-      <w:bookmarkStart w:id="42" w:name="_Toc226195291"/>
+      <w:bookmarkStart w:id="41" w:name="_Toc226195291"/>
       <w:r>
         <w:t>The Linear-Up / Log-Down Hybrid</w:t>
       </w:r>
+      <w:bookmarkEnd w:id="41"/>
+    </w:p>
+    <w:p>
+      <w:pPr>
+        <w:spacing w:after="120" w:line="276" w:lineRule="auto"/>
+      </w:pPr>
+      <w:r>
+        <w:t>Proposed by Yeh and Kwan (1978): use the linear formula during the ascending phase (no exponential assumption valid) and the log formula during the descending phase (mono-exponential assumption appropriate). This is the default in the NCA Assistant, in Phoenix WinNonlin, and in most regulatory submissions.</w:t>
+      </w:r>
+    </w:p>
+    <w:p>
+      <w:pPr>
+        <w:pStyle w:val="Kop2"/>
+      </w:pPr>
+      <w:bookmarkStart w:id="42" w:name="_Toc226195292"/>
+      <w:r>
+        <w:t>Terminal Phase Characterisation and Half-Life Estimation</w:t>
+      </w:r>
       <w:bookmarkEnd w:id="42"/>
     </w:p>
     <w:p>
       <w:pPr>
-        <w:spacing w:after="120" w:line="276" w:lineRule="auto"/>
-      </w:pPr>
-      <w:r>
-        <w:t>Proposed by Yeh and Kwan (1978): use the linear formula during the ascending phase (no exponential assumption valid) and the log formula during the descending phase (mono-exponential assumption appropriate). This is the default in the NCA Assistant, in Phoenix WinNonlin, and in most regulatory submissions.</w:t>
-      </w:r>
-    </w:p>
-    <w:p>
-      <w:pPr>
-        <w:pStyle w:val="Kop2"/>
-      </w:pPr>
-      <w:bookmarkStart w:id="43" w:name="_Toc226195292"/>
-      <w:r>
-        <w:t>Terminal Phase Characterisation and Half-Life Estimation</w:t>
+        <w:pStyle w:val="Kop3"/>
+      </w:pPr>
+      <w:bookmarkStart w:id="43" w:name="_Toc226195293"/>
+      <w:r>
+        <w:t>What Is the Terminal Phase?</w:t>
       </w:r>
       <w:bookmarkEnd w:id="43"/>
-    </w:p>
-    <w:p>
-      <w:pPr>
-        <w:pStyle w:val="Kop3"/>
-      </w:pPr>
-      <w:bookmarkStart w:id="44" w:name="_Toc226195293"/>
-      <w:r>
-        <w:t>What Is the Terminal Phase?</w:t>
-      </w:r>
-      <w:bookmarkEnd w:id="44"/>
     </w:p>
     <w:p>
       <w:pPr>
@@ -7376,11 +9300,11 @@
       <w:pPr>
         <w:pStyle w:val="Kop3"/>
       </w:pPr>
-      <w:bookmarkStart w:id="45" w:name="_Toc226195294"/>
+      <w:bookmarkStart w:id="44" w:name="_Toc226195294"/>
       <w:r>
         <w:t>Automated Point Selection</w:t>
       </w:r>
-      <w:bookmarkEnd w:id="45"/>
+      <w:bookmarkEnd w:id="44"/>
     </w:p>
     <w:p>
       <w:pPr>
@@ -7412,11 +9336,11 @@
       <w:pPr>
         <w:pStyle w:val="Kop3"/>
       </w:pPr>
-      <w:bookmarkStart w:id="46" w:name="_Toc226195295"/>
+      <w:bookmarkStart w:id="45" w:name="_Toc226195295"/>
       <w:r>
         <w:t>Manual Point Selection</w:t>
       </w:r>
-      <w:bookmarkEnd w:id="46"/>
+      <w:bookmarkEnd w:id="45"/>
     </w:p>
     <w:p>
       <w:pPr>
@@ -7439,11 +9363,11 @@
       <w:pPr>
         <w:pStyle w:val="Kop2"/>
       </w:pPr>
-      <w:bookmarkStart w:id="47" w:name="_Toc226195296"/>
+      <w:bookmarkStart w:id="46" w:name="_Toc226195296"/>
       <w:r>
         <w:t>BLQ Handling: Pharmacological Rationale</w:t>
       </w:r>
-      <w:bookmarkEnd w:id="47"/>
+      <w:bookmarkEnd w:id="46"/>
     </w:p>
     <w:p>
       <w:pPr>
@@ -7458,11 +9382,11 @@
       <w:pPr>
         <w:pStyle w:val="Kop2"/>
       </w:pPr>
-      <w:bookmarkStart w:id="48" w:name="_Toc226195297"/>
+      <w:bookmarkStart w:id="47" w:name="_Toc226195297"/>
       <w:r>
         <w:t>Steady-State Considerations</w:t>
       </w:r>
-      <w:bookmarkEnd w:id="48"/>
+      <w:bookmarkEnd w:id="47"/>
     </w:p>
     <w:p>
       <w:pPr>
@@ -7526,22 +9450,22 @@
       <w:pPr>
         <w:pStyle w:val="Kop1"/>
       </w:pPr>
-      <w:bookmarkStart w:id="49" w:name="_Toc226195298"/>
+      <w:bookmarkStart w:id="48" w:name="_Toc226195298"/>
       <w:r>
         <w:lastRenderedPageBreak/>
         <w:t>Part VI: Statistical Methods</w:t>
       </w:r>
+      <w:bookmarkEnd w:id="48"/>
+    </w:p>
+    <w:p>
+      <w:pPr>
+        <w:pStyle w:val="Kop2"/>
+      </w:pPr>
+      <w:bookmarkStart w:id="49" w:name="_Toc226195299"/>
+      <w:r>
+        <w:t>The Two One-Sided Tests (TOST) Procedure</w:t>
+      </w:r>
       <w:bookmarkEnd w:id="49"/>
-    </w:p>
-    <w:p>
-      <w:pPr>
-        <w:pStyle w:val="Kop2"/>
-      </w:pPr>
-      <w:bookmarkStart w:id="50" w:name="_Toc226195299"/>
-      <w:r>
-        <w:t>The Two One-Sided Tests (TOST) Procedure</w:t>
-      </w:r>
-      <w:bookmarkEnd w:id="50"/>
     </w:p>
     <w:p>
       <w:pPr>
@@ -7620,11 +9544,11 @@
       <w:pPr>
         <w:pStyle w:val="Kop2"/>
       </w:pPr>
-      <w:bookmarkStart w:id="51" w:name="_Toc226195300"/>
+      <w:bookmarkStart w:id="50" w:name="_Toc226195300"/>
       <w:r>
         <w:t>The ANOVA Model for Crossover Designs</w:t>
       </w:r>
-      <w:bookmarkEnd w:id="51"/>
+      <w:bookmarkEnd w:id="50"/>
     </w:p>
     <w:p>
       <w:pPr>
@@ -7661,37 +9585,37 @@
       <w:pPr>
         <w:pStyle w:val="Kop2"/>
       </w:pPr>
-      <w:bookmarkStart w:id="52" w:name="_Toc226195301"/>
+      <w:bookmarkStart w:id="51" w:name="_Toc226195301"/>
       <w:r>
         <w:t>Fixed-Effects vs. Mixed-Effects Models</w:t>
       </w:r>
+      <w:bookmarkEnd w:id="51"/>
+    </w:p>
+    <w:p>
+      <w:pPr>
+        <w:spacing w:after="120" w:line="276" w:lineRule="auto"/>
+      </w:pPr>
+      <w:r>
+        <w:t>Fixed-effects (lm): all terms including Subject are fixed. Valid for balanced data. Residual df = N − 2 for 2×2×2.</w:t>
+      </w:r>
+    </w:p>
+    <w:p>
+      <w:pPr>
+        <w:spacing w:after="120" w:line="276" w:lineRule="auto"/>
+      </w:pPr>
+      <w:r>
+        <w:t>Mixed-effects (nlme::lme): Subject is a random effect. Handles dropouts, separates between- and within-subject variance. Uses the containment method for denominator df. FDA recommends mixed-effects; EMA accepts both.</w:t>
+      </w:r>
+    </w:p>
+    <w:p>
+      <w:pPr>
+        <w:pStyle w:val="Kop2"/>
+      </w:pPr>
+      <w:bookmarkStart w:id="52" w:name="_Toc226195302"/>
+      <w:r>
+        <w:t>Confidence Interval Construction</w:t>
+      </w:r>
       <w:bookmarkEnd w:id="52"/>
-    </w:p>
-    <w:p>
-      <w:pPr>
-        <w:spacing w:after="120" w:line="276" w:lineRule="auto"/>
-      </w:pPr>
-      <w:r>
-        <w:t>Fixed-effects (lm): all terms including Subject are fixed. Valid for balanced data. Residual df = N − 2 for 2×2×2.</w:t>
-      </w:r>
-    </w:p>
-    <w:p>
-      <w:pPr>
-        <w:spacing w:after="120" w:line="276" w:lineRule="auto"/>
-      </w:pPr>
-      <w:r>
-        <w:t>Mixed-effects (nlme::lme): Subject is a random effect. Handles dropouts, separates between- and within-subject variance. Uses the containment method for denominator df. FDA recommends mixed-effects; EMA accepts both.</w:t>
-      </w:r>
-    </w:p>
-    <w:p>
-      <w:pPr>
-        <w:pStyle w:val="Kop2"/>
-      </w:pPr>
-      <w:bookmarkStart w:id="53" w:name="_Toc226195302"/>
-      <w:r>
-        <w:t>Confidence Interval Construction</w:t>
-      </w:r>
-      <w:bookmarkEnd w:id="53"/>
     </w:p>
     <w:p>
       <w:pPr>
@@ -7720,11 +9644,11 @@
       <w:pPr>
         <w:pStyle w:val="Kop2"/>
       </w:pPr>
-      <w:bookmarkStart w:id="54" w:name="_Toc226195303"/>
+      <w:bookmarkStart w:id="53" w:name="_Toc226195303"/>
       <w:r>
         <w:t>Design-Specific Models</w:t>
       </w:r>
-      <w:bookmarkEnd w:id="54"/>
+      <w:bookmarkEnd w:id="53"/>
     </w:p>
     <w:p>
       <w:pPr>
@@ -7793,11 +9717,11 @@
       <w:pPr>
         <w:pStyle w:val="Kop2"/>
       </w:pPr>
-      <w:bookmarkStart w:id="55" w:name="_Toc226195304"/>
+      <w:bookmarkStart w:id="54" w:name="_Toc226195304"/>
       <w:r>
         <w:t>Drug–Drug Interaction Analysis</w:t>
       </w:r>
-      <w:bookmarkEnd w:id="55"/>
+      <w:bookmarkEnd w:id="54"/>
     </w:p>
     <w:p>
       <w:pPr>
@@ -7805,6 +9729,8 @@
       </w:pPr>
       <w:r>
         <w:t xml:space="preserve">DDI studies use the same statistical framework as BE. The ANOVA model, 90% CI, and geometric mean ratio are computed identically. The difference is interpretation: the ratio </w:t>
+      </w:r>
+      <w:r>
         <w:lastRenderedPageBreak/>
         <w:t>quantifies the fold-change in exposure caused by the interacting drug, and the comparison is against DDI classification thresholds (see Part III) rather than BE acceptance limits.</w:t>
       </w:r>
@@ -7830,11 +9756,11 @@
       <w:pPr>
         <w:pStyle w:val="Kop2"/>
       </w:pPr>
-      <w:bookmarkStart w:id="56" w:name="_Toc226195305"/>
+      <w:bookmarkStart w:id="55" w:name="_Toc226195305"/>
       <w:r>
         <w:t>Power and Sample Size for Bioequivalence</w:t>
       </w:r>
-      <w:bookmarkEnd w:id="56"/>
+      <w:bookmarkEnd w:id="55"/>
     </w:p>
     <w:p>
       <w:pPr>
@@ -7861,11 +9787,11 @@
       <w:pPr>
         <w:pStyle w:val="Kop2"/>
       </w:pPr>
-      <w:bookmarkStart w:id="57" w:name="_Toc226195306"/>
+      <w:bookmarkStart w:id="56" w:name="_Toc226195306"/>
       <w:r>
         <w:t>Regulatory Guidelines</w:t>
       </w:r>
-      <w:bookmarkEnd w:id="57"/>
+      <w:bookmarkEnd w:id="56"/>
     </w:p>
     <w:p>
       <w:pPr>
@@ -7966,22 +9892,22 @@
       <w:pPr>
         <w:pStyle w:val="Kop1"/>
       </w:pPr>
-      <w:bookmarkStart w:id="58" w:name="_Toc226195307"/>
+      <w:bookmarkStart w:id="57" w:name="_Toc226195307"/>
       <w:r>
         <w:lastRenderedPageBreak/>
         <w:t>Appendices</w:t>
       </w:r>
+      <w:bookmarkEnd w:id="57"/>
+    </w:p>
+    <w:p>
+      <w:pPr>
+        <w:pStyle w:val="Kop2"/>
+      </w:pPr>
+      <w:bookmarkStart w:id="58" w:name="_Toc226195308"/>
+      <w:r>
+        <w:t>Appendix A: Glossary</w:t>
+      </w:r>
       <w:bookmarkEnd w:id="58"/>
-    </w:p>
-    <w:p>
-      <w:pPr>
-        <w:pStyle w:val="Kop2"/>
-      </w:pPr>
-      <w:bookmarkStart w:id="59" w:name="_Toc226195308"/>
-      <w:r>
-        <w:t>Appendix A: Glossary</w:t>
-      </w:r>
-      <w:bookmarkEnd w:id="59"/>
     </w:p>
     <w:tbl>
       <w:tblPr>
@@ -9259,11 +11185,11 @@
       <w:pPr>
         <w:pStyle w:val="Kop2"/>
       </w:pPr>
-      <w:bookmarkStart w:id="60" w:name="_Toc226195309"/>
+      <w:bookmarkStart w:id="59" w:name="_Toc226195309"/>
       <w:r>
         <w:t>Appendix B: Recognised Column Names</w:t>
       </w:r>
-      <w:bookmarkEnd w:id="60"/>
+      <w:bookmarkEnd w:id="59"/>
     </w:p>
     <w:tbl>
       <w:tblPr>
@@ -9731,11 +11657,11 @@
       <w:pPr>
         <w:pStyle w:val="Kop2"/>
       </w:pPr>
-      <w:bookmarkStart w:id="61" w:name="_Toc226195310"/>
+      <w:bookmarkStart w:id="60" w:name="_Toc226195310"/>
       <w:r>
         <w:t>Appendix C: Troubleshooting</w:t>
       </w:r>
-      <w:bookmarkEnd w:id="61"/>
+      <w:bookmarkEnd w:id="60"/>
     </w:p>
     <w:p>
       <w:pPr>
@@ -9817,11 +11743,11 @@
       <w:pPr>
         <w:pStyle w:val="Kop2"/>
       </w:pPr>
-      <w:bookmarkStart w:id="62" w:name="_Toc226195311"/>
+      <w:bookmarkStart w:id="61" w:name="_Toc226195311"/>
       <w:r>
         <w:t>Appendix D: Software References</w:t>
       </w:r>
-      <w:bookmarkEnd w:id="62"/>
+      <w:bookmarkEnd w:id="61"/>
     </w:p>
     <w:p>
       <w:pPr>

</xml_diff>